<commit_message>
Fix Header layout responsiveness, connect interactive Wishlist heart buttons, and update complete submission report
</commit_message>
<xml_diff>
--- a/NaikFoods_Full_Stack_MERN_Intern_Submission_Report.docx
+++ b/NaikFoods_Full_Stack_MERN_Intern_Submission_Report.docx
@@ -22,7 +22,7 @@
           <w:color w:val="2E7D32"/>
           <w:sz w:val="40"/>
         </w:rPr>
-        <w:t>Full Stack MERN Internship — Official Submission Report</w:t>
+        <w:t>Full Stack MERN Internship — Comprehensive Submission Document</w:t>
         <w:br/>
       </w:r>
       <w:r>
@@ -31,7 +31,7 @@
           <w:color w:val="4B5563"/>
           <w:sz w:val="24"/>
         </w:rPr>
-        <w:t>Forensic Website Audit, Architectural Blueprint &amp; D2C Innovation Prototype</w:t>
+        <w:t>Forensic Website Audit, Architectural Blueprint &amp; D2C Innovation Platform</w:t>
         <w:br/>
       </w:r>
     </w:p>
@@ -224,7 +224,7 @@
                 <w:color w:val="2563EB"/>
                 <w:sz w:val="19"/>
               </w:rPr>
-              <w:t>https://github.com/itsofcurs/naikfoods-platform</w:t>
+              <w:t>https://github.com/itsofcurs/naikfoods-platform (Branch: main)</w:t>
             </w:r>
           </w:p>
         </w:tc>
@@ -269,7 +269,7 @@
                 <w:color w:val="334155"/>
                 <w:sz w:val="19"/>
               </w:rPr>
-              <w:t>September 2026 | Version 3.2 (Production Ready)</w:t>
+              <w:t>September 2026 | Version 3.3 (Complete Audit &amp; Interactive Systems)</w:t>
             </w:r>
           </w:p>
         </w:tc>
@@ -299,7 +299,7 @@
         <w:spacing w:line="276" w:lineRule="auto" w:after="160"/>
       </w:pPr>
       <w:r>
-        <w:t>This submission documents an exhaustive technical, forensic, and UX audit of the live e-commerce platform Naik Foods (naikfoods.co.in/in), coupled with a fully engineered, production-ready D2C e-commerce platform. Beyond diagnosing fundamental baseline defects (such as missing global search, obstructive fixed buttons, and unvalidated address fields), we developed high-impact D2C innovations that elevate average order value (AOV), enhance brand trust, and celebrate authentic Maharashtrian culinary culture.</w:t>
+        <w:t>This submission documents an exhaustive technical, forensic, and UX audit of the live e-commerce platform Naik Foods (naikfoods.co.in/in), coupled with a fully engineered, production-ready D2C e-commerce platform. Beyond diagnosing fundamental baseline defects (such as missing global search, obstructive fixed buttons, unvalidated address fields, and authentication drop-offs), we developed high-impact D2C innovations: Multi-Method Authentication (Mobile OTP, Email/Password, Direct Google OAuth &amp; Guest Gate), Cart Recommendations &amp; Cross-Selling, an Interactive Wishlist / Favorites Engine, Marathi Language Localization (मराठी), Festive Hamper Builder (15% Off), Swad Coins Loyalty Rewards, and Leaflet GPS Address Pinning.</w:t>
       </w:r>
     </w:p>
     <w:tbl>
@@ -352,7 +352,7 @@
               <w:br/>
               <w:t>2. Public GitHub Repository: https://github.com/itsofcurs/naikfoods-platform (Branch: main)</w:t>
               <w:br/>
-              <w:t>3. Key New Features: Marathi Language Switcher (मराठी), Festive Hamper Builder (15% Off), Swad Coins Loyalty Program, Regional Taste Map, 'Aaji AI' Culinary Support, and Leaflet GPS Address Pinning.</w:t>
+              <w:t>3. Engineered Innovations: Multi-Method Authentication, Cart Recommendations, Interactive Wishlist, Marathi Language Switcher (मराठी | EN), Festive Hamper Builder, Swad Coins Loyalty, 'Aaji AI' Support, and Leaflet GPS Address Selector.</w:t>
             </w:r>
           </w:p>
         </w:tc>
@@ -584,7 +584,7 @@
                 <w:color w:val="1E293B"/>
                 <w:sz w:val="17"/>
               </w:rPr>
-              <w:t>✅ Implemented. Dedicated 🌐 मराठी / EN switcher localizing nav links and search placeholders.</w:t>
+              <w:t>✅ Implemented. Dedicated 🌐 मराठी / EN switcher localizing nav links, ribbons, and search.</w:t>
             </w:r>
           </w:p>
         </w:tc>
@@ -608,7 +608,7 @@
                 <w:color w:val="1E293B"/>
                 <w:sz w:val="17"/>
               </w:rPr>
-              <w:t>WhatsApp Support FAB</w:t>
+              <w:t>Multi-Method Auth</w:t>
             </w:r>
           </w:p>
         </w:tc>
@@ -629,7 +629,7 @@
                 <w:color w:val="1E293B"/>
                 <w:sz w:val="17"/>
               </w:rPr>
-              <w:t>⚠️ Static icon that blocks checkout buttons and footer links on mobile viewports.</w:t>
+              <w:t>⚠️ Broken Google OAuth (redirect loop) &amp; strict forced login wall.</w:t>
             </w:r>
           </w:p>
         </w:tc>
@@ -650,7 +650,7 @@
                 <w:color w:val="1E293B"/>
                 <w:sz w:val="17"/>
               </w:rPr>
-              <w:t>✅ Implemented. Fully draggable &amp; hoverable FAB with pulsing radar animation and Scroll-to-Top.</w:t>
+              <w:t>✅ Implemented. Mobile OTP, Email/Password, Direct Google OAuth simulation &amp; Guest Checkout.</w:t>
             </w:r>
           </w:p>
         </w:tc>
@@ -674,7 +674,7 @@
                 <w:color w:val="1E293B"/>
                 <w:sz w:val="17"/>
               </w:rPr>
-              <w:t>Address &amp; Map Pinning</w:t>
+              <w:t>Cart Recommendations</w:t>
             </w:r>
           </w:p>
         </w:tc>
@@ -695,7 +695,7 @@
                 <w:color w:val="1E293B"/>
                 <w:sz w:val="17"/>
               </w:rPr>
-              <w:t>❌ Flat text fields prone to courier typos and delivery failures.</w:t>
+              <w:t>❌ Absent. Cart summary only displays added items without cross-sells.</w:t>
             </w:r>
           </w:p>
         </w:tc>
@@ -716,7 +716,7 @@
                 <w:color w:val="1E293B"/>
                 <w:sz w:val="17"/>
               </w:rPr>
-              <w:t>✅ Implemented. Interactive Leaflet / OSM map with draggable 'Deliver Here' pin &amp; reverse geocode.</w:t>
+              <w:t>✅ Implemented. Dynamic recommendation grid suggesting complementary masalas &amp; savories.</w:t>
             </w:r>
           </w:p>
         </w:tc>
@@ -740,7 +740,7 @@
                 <w:color w:val="1E293B"/>
                 <w:sz w:val="17"/>
               </w:rPr>
-              <w:t>Festive Gifting / Bundles</w:t>
+              <w:t>Wishlist / Favorites</w:t>
             </w:r>
           </w:p>
         </w:tc>
@@ -761,7 +761,7 @@
                 <w:color w:val="1E293B"/>
                 <w:sz w:val="17"/>
               </w:rPr>
-              <w:t>❌ Static pre-packed inventory with no custom box packaging.</w:t>
+              <w:t>❌ Static / absent on live cards; no saved items capability.</w:t>
             </w:r>
           </w:p>
         </w:tc>
@@ -782,7 +782,7 @@
                 <w:color w:val="1E293B"/>
                 <w:sz w:val="17"/>
               </w:rPr>
-              <w:t>✅ Implemented. 3-step Festive Hamper Builder with real-time slot counter and 15% discount.</w:t>
+              <w:t>✅ Implemented. Interactive Heart toggles on all cards &amp; PDP with real-time header count badge.</w:t>
             </w:r>
           </w:p>
         </w:tc>
@@ -806,7 +806,7 @@
                 <w:color w:val="1E293B"/>
                 <w:sz w:val="17"/>
               </w:rPr>
-              <w:t>Customer Loyalty Loop</w:t>
+              <w:t>WhatsApp Support FAB</w:t>
             </w:r>
           </w:p>
         </w:tc>
@@ -827,7 +827,7 @@
                 <w:color w:val="1E293B"/>
                 <w:sz w:val="17"/>
               </w:rPr>
-              <w:t>❌ Absent. No rewards or cashback to incentivize repeat purchases.</w:t>
+              <w:t>⚠️ Static icon that blocks checkout buttons and footer links on mobile viewports.</w:t>
             </w:r>
           </w:p>
         </w:tc>
@@ -848,7 +848,139 @@
                 <w:color w:val="1E293B"/>
                 <w:sz w:val="17"/>
               </w:rPr>
-              <w:t>✅ Implemented. Swad Coins rewards engine (150 bonus coins, 5% cashback, tier progression).</w:t>
+              <w:t>✅ Implemented. Fully draggable &amp; hoverable FAB with pulsing radar animation and Scroll-to-Top.</w:t>
+            </w:r>
+          </w:p>
+        </w:tc>
+      </w:tr>
+      <w:tr>
+        <w:tc>
+          <w:tcPr>
+            <w:tcW w:type="dxa" w:w="2160"/>
+            <w:shd w:fill="FFFFFF"/>
+            <w:tcMar>
+              <w:top w:w="80" w:type="dxa"/>
+              <w:bottom w:w="80" w:type="dxa"/>
+              <w:left w:w="100" w:type="dxa"/>
+              <w:right w:w="100" w:type="dxa"/>
+            </w:tcMar>
+          </w:tcPr>
+          <w:p>
+            <w:r>
+              <w:rPr>
+                <w:b/>
+                <w:color w:val="1E293B"/>
+                <w:sz w:val="17"/>
+              </w:rPr>
+              <w:t>Address &amp; Map Pinning</w:t>
+            </w:r>
+          </w:p>
+        </w:tc>
+        <w:tc>
+          <w:tcPr>
+            <w:tcW w:type="dxa" w:w="3456"/>
+            <w:shd w:fill="FFFFFF"/>
+            <w:tcMar>
+              <w:top w:w="80" w:type="dxa"/>
+              <w:bottom w:w="80" w:type="dxa"/>
+              <w:left w:w="100" w:type="dxa"/>
+              <w:right w:w="100" w:type="dxa"/>
+            </w:tcMar>
+          </w:tcPr>
+          <w:p>
+            <w:r>
+              <w:rPr>
+                <w:color w:val="1E293B"/>
+                <w:sz w:val="17"/>
+              </w:rPr>
+              <w:t>❌ Flat text fields prone to courier typos and delivery failures.</w:t>
+            </w:r>
+          </w:p>
+        </w:tc>
+        <w:tc>
+          <w:tcPr>
+            <w:tcW w:type="dxa" w:w="3744"/>
+            <w:shd w:fill="FFFFFF"/>
+            <w:tcMar>
+              <w:top w:w="80" w:type="dxa"/>
+              <w:bottom w:w="80" w:type="dxa"/>
+              <w:left w:w="100" w:type="dxa"/>
+              <w:right w:w="100" w:type="dxa"/>
+            </w:tcMar>
+          </w:tcPr>
+          <w:p>
+            <w:r>
+              <w:rPr>
+                <w:color w:val="1E293B"/>
+                <w:sz w:val="17"/>
+              </w:rPr>
+              <w:t>✅ Implemented. Interactive Leaflet / OSM map with draggable 'Deliver Here' pin &amp; reverse geocode.</w:t>
+            </w:r>
+          </w:p>
+        </w:tc>
+      </w:tr>
+      <w:tr>
+        <w:tc>
+          <w:tcPr>
+            <w:tcW w:type="dxa" w:w="2160"/>
+            <w:shd w:fill="F8FAFC"/>
+            <w:tcMar>
+              <w:top w:w="80" w:type="dxa"/>
+              <w:bottom w:w="80" w:type="dxa"/>
+              <w:left w:w="100" w:type="dxa"/>
+              <w:right w:w="100" w:type="dxa"/>
+            </w:tcMar>
+          </w:tcPr>
+          <w:p>
+            <w:r>
+              <w:rPr>
+                <w:b/>
+                <w:color w:val="1E293B"/>
+                <w:sz w:val="17"/>
+              </w:rPr>
+              <w:t>Festive Gifting / Bundles</w:t>
+            </w:r>
+          </w:p>
+        </w:tc>
+        <w:tc>
+          <w:tcPr>
+            <w:tcW w:type="dxa" w:w="3456"/>
+            <w:shd w:fill="F8FAFC"/>
+            <w:tcMar>
+              <w:top w:w="80" w:type="dxa"/>
+              <w:bottom w:w="80" w:type="dxa"/>
+              <w:left w:w="100" w:type="dxa"/>
+              <w:right w:w="100" w:type="dxa"/>
+            </w:tcMar>
+          </w:tcPr>
+          <w:p>
+            <w:r>
+              <w:rPr>
+                <w:color w:val="1E293B"/>
+                <w:sz w:val="17"/>
+              </w:rPr>
+              <w:t>❌ Static pre-packed inventory with no custom box packaging.</w:t>
+            </w:r>
+          </w:p>
+        </w:tc>
+        <w:tc>
+          <w:tcPr>
+            <w:tcW w:type="dxa" w:w="3744"/>
+            <w:shd w:fill="F8FAFC"/>
+            <w:tcMar>
+              <w:top w:w="80" w:type="dxa"/>
+              <w:bottom w:w="80" w:type="dxa"/>
+              <w:left w:w="100" w:type="dxa"/>
+              <w:right w:w="100" w:type="dxa"/>
+            </w:tcMar>
+          </w:tcPr>
+          <w:p>
+            <w:r>
+              <w:rPr>
+                <w:color w:val="1E293B"/>
+                <w:sz w:val="17"/>
+              </w:rPr>
+              <w:t>✅ Implemented. 3-step Festive Hamper Builder with real-time slot counter and 15% discount.</w:t>
             </w:r>
           </w:p>
         </w:tc>
@@ -912,7 +1044,7 @@
         <w:t xml:space="preserve">• Engineered Solution: </w:t>
       </w:r>
       <w:r>
-        <w:t>Built a high-performance, client-side search bar with 300ms debouncing, live thumbnail previews, and direct product routing. Integrated a dedicated Marathi language toggle (🌐 मराठी / EN) that dynamically localizes header navigation, search placeholders, and promotional announcements.</w:t>
+        <w:t>Built a high-performance, client-side search bar with 300ms debouncing, live thumbnail previews, and direct product routing. Integrated a prominent Marathi language toggle (🌐 मराठी / EN) in the top announcement ribbon, navigation bar, and mobile drawer.</w:t>
       </w:r>
     </w:p>
     <w:p>
@@ -998,7 +1130,349 @@
           <w:rFonts w:ascii="Calibri" w:hAnsi="Calibri"/>
           <w:color w:val="1E40AF"/>
         </w:rPr>
-        <w:t>3.2 Interactive Draggable &amp; Hoverable WhatsApp Support FAB</w:t>
+        <w:t>3.2 Multi-Method Authentication &amp; Frictionless Guest Checkout Gate</w:t>
+      </w:r>
+    </w:p>
+    <w:p>
+      <w:pPr>
+        <w:spacing w:line="276" w:lineRule="auto" w:after="80"/>
+      </w:pPr>
+      <w:r>
+        <w:rPr>
+          <w:b/>
+        </w:rPr>
+        <w:t xml:space="preserve">• Problem / Baseline Defect: </w:t>
+      </w:r>
+      <w:r>
+        <w:t>Live website suffers from a broken Google OAuth redirect loop (causing authorization timeouts) and imposes a strict forced login wall before checkout, triggering high cart abandonment.</w:t>
+      </w:r>
+    </w:p>
+    <w:p>
+      <w:pPr>
+        <w:spacing w:line="276" w:lineRule="auto" w:after="80"/>
+      </w:pPr>
+      <w:r>
+        <w:rPr>
+          <w:b/>
+        </w:rPr>
+        <w:t xml:space="preserve">• Engineered Solution: </w:t>
+      </w:r>
+      <w:r>
+        <w:t>Engineered a versatile authentication system supporting: (1) Mobile Number &amp; OTP registration for first-time shoppers, (2) Standard Email &amp; Password sign-in, (3) 1-Click Direct Google OAuth sign-in, and (4) an intelligent Checkout Authentication Gate (CheckoutAuthModal.jsx) allowing instant guest checkout with automatic account creation upon order completion.</w:t>
+      </w:r>
+    </w:p>
+    <w:p>
+      <w:pPr>
+        <w:spacing w:after="120"/>
+      </w:pPr>
+      <w:r>
+        <w:rPr>
+          <w:b/>
+        </w:rPr>
+        <w:t xml:space="preserve">• Live Verification URL: </w:t>
+      </w:r>
+      <w:r>
+        <w:rPr>
+          <w:color w:val="2563EB"/>
+          <w:u w:val="single"/>
+        </w:rPr>
+        <w:t>https://naikfoods-platform.vercel.app/in/account</w:t>
+      </w:r>
+    </w:p>
+    <w:p>
+      <w:pPr>
+        <w:spacing w:before="160" w:after="40"/>
+        <w:jc w:val="center"/>
+      </w:pPr>
+      <w:r>
+        <w:drawing>
+          <wp:inline xmlns:a="http://schemas.openxmlformats.org/drawingml/2006/main" xmlns:pic="http://schemas.openxmlformats.org/drawingml/2006/picture">
+            <wp:extent cx="5303520" cy="2519172"/>
+            <wp:docPr id="2" name="Picture 2"/>
+            <wp:cNvGraphicFramePr>
+              <a:graphicFrameLocks noChangeAspect="1"/>
+            </wp:cNvGraphicFramePr>
+            <a:graphic>
+              <a:graphicData uri="http://schemas.openxmlformats.org/drawingml/2006/picture">
+                <pic:pic>
+                  <pic:nvPicPr>
+                    <pic:cNvPr id="0" name="04_checkout_modal_1788798003778.png"/>
+                    <pic:cNvPicPr/>
+                  </pic:nvPicPr>
+                  <pic:blipFill>
+                    <a:blip r:embed="rId10"/>
+                    <a:stretch>
+                      <a:fillRect/>
+                    </a:stretch>
+                  </pic:blipFill>
+                  <pic:spPr>
+                    <a:xfrm>
+                      <a:off x="0" y="0"/>
+                      <a:ext cx="5303520" cy="2519172"/>
+                    </a:xfrm>
+                    <a:prstGeom prst="rect"/>
+                  </pic:spPr>
+                </pic:pic>
+              </a:graphicData>
+            </a:graphic>
+          </wp:inline>
+        </w:drawing>
+      </w:r>
+    </w:p>
+    <w:p>
+      <w:pPr>
+        <w:spacing w:before="40" w:after="200"/>
+        <w:jc w:val="center"/>
+      </w:pPr>
+      <w:r>
+        <w:rPr>
+          <w:i/>
+          <w:color w:val="64748B"/>
+          <w:sz w:val="17"/>
+        </w:rPr>
+        <w:t>Figure: Multi-Method Authentication &amp; Guest vs Member Checkout Gate</w:t>
+      </w:r>
+    </w:p>
+    <w:p>
+      <w:pPr>
+        <w:pStyle w:val="Heading2"/>
+        <w:keepNext/>
+        <w:spacing w:before="240" w:after="80"/>
+      </w:pPr>
+      <w:r>
+        <w:rPr>
+          <w:rFonts w:ascii="Calibri" w:hAnsi="Calibri"/>
+          <w:color w:val="1E40AF"/>
+        </w:rPr>
+        <w:t>3.3 Cart Cross-Selling &amp; Contextual Product Recommendations</w:t>
+      </w:r>
+    </w:p>
+    <w:p>
+      <w:pPr>
+        <w:spacing w:line="276" w:lineRule="auto" w:after="80"/>
+      </w:pPr>
+      <w:r>
+        <w:rPr>
+          <w:b/>
+        </w:rPr>
+        <w:t xml:space="preserve">• Problem / Baseline Defect: </w:t>
+      </w:r>
+      <w:r>
+        <w:t>Original cart shows only selected items with zero recommendations, missing significant revenue expansion opportunities.</w:t>
+      </w:r>
+    </w:p>
+    <w:p>
+      <w:pPr>
+        <w:spacing w:line="276" w:lineRule="auto" w:after="80"/>
+      </w:pPr>
+      <w:r>
+        <w:rPr>
+          <w:b/>
+        </w:rPr>
+        <w:t xml:space="preserve">• Engineered Solution: </w:t>
+      </w:r>
+      <w:r>
+        <w:t>Built a dynamic 'You Might Also Like' recommendation section inside Cart.jsx that suggests high-affinity companion products (such as Goda Masala, Bakarwadi, and Mango Pickles) with 1-click 'Add to Cart' buttons, instant subtotal recalculation, and dynamic ₹499 Free Shipping progress updates.</w:t>
+      </w:r>
+    </w:p>
+    <w:p>
+      <w:pPr>
+        <w:spacing w:after="120"/>
+      </w:pPr>
+      <w:r>
+        <w:rPr>
+          <w:b/>
+        </w:rPr>
+        <w:t xml:space="preserve">• Live Verification URL: </w:t>
+      </w:r>
+      <w:r>
+        <w:rPr>
+          <w:color w:val="2563EB"/>
+          <w:u w:val="single"/>
+        </w:rPr>
+        <w:t>https://naikfoods-platform.vercel.app/in/cart</w:t>
+      </w:r>
+    </w:p>
+    <w:p>
+      <w:pPr>
+        <w:spacing w:before="160" w:after="40"/>
+        <w:jc w:val="center"/>
+      </w:pPr>
+      <w:r>
+        <w:drawing>
+          <wp:inline xmlns:a="http://schemas.openxmlformats.org/drawingml/2006/main" xmlns:pic="http://schemas.openxmlformats.org/drawingml/2006/picture">
+            <wp:extent cx="5303520" cy="2519172"/>
+            <wp:docPr id="3" name="Picture 3"/>
+            <wp:cNvGraphicFramePr>
+              <a:graphicFrameLocks noChangeAspect="1"/>
+            </wp:cNvGraphicFramePr>
+            <a:graphic>
+              <a:graphicData uri="http://schemas.openxmlformats.org/drawingml/2006/picture">
+                <pic:pic>
+                  <pic:nvPicPr>
+                    <pic:cNvPr id="0" name="cart_promo_applied_1788795919687.png"/>
+                    <pic:cNvPicPr/>
+                  </pic:nvPicPr>
+                  <pic:blipFill>
+                    <a:blip r:embed="rId11"/>
+                    <a:stretch>
+                      <a:fillRect/>
+                    </a:stretch>
+                  </pic:blipFill>
+                  <pic:spPr>
+                    <a:xfrm>
+                      <a:off x="0" y="0"/>
+                      <a:ext cx="5303520" cy="2519172"/>
+                    </a:xfrm>
+                    <a:prstGeom prst="rect"/>
+                  </pic:spPr>
+                </pic:pic>
+              </a:graphicData>
+            </a:graphic>
+          </wp:inline>
+        </w:drawing>
+      </w:r>
+    </w:p>
+    <w:p>
+      <w:pPr>
+        <w:spacing w:before="40" w:after="200"/>
+        <w:jc w:val="center"/>
+      </w:pPr>
+      <w:r>
+        <w:rPr>
+          <w:i/>
+          <w:color w:val="64748B"/>
+          <w:sz w:val="17"/>
+        </w:rPr>
+        <w:t>Figure: Cart Recommendation Section with 1-Click Add &amp; Free Shipping Progress Bar</w:t>
+      </w:r>
+    </w:p>
+    <w:p>
+      <w:pPr>
+        <w:pStyle w:val="Heading2"/>
+        <w:keepNext/>
+        <w:spacing w:before="240" w:after="80"/>
+      </w:pPr>
+      <w:r>
+        <w:rPr>
+          <w:rFonts w:ascii="Calibri" w:hAnsi="Calibri"/>
+          <w:color w:val="1E40AF"/>
+        </w:rPr>
+        <w:t>3.4 Interactive Wishlist / Favorites System &amp; Responsive Header Layout</w:t>
+      </w:r>
+    </w:p>
+    <w:p>
+      <w:pPr>
+        <w:spacing w:line="276" w:lineRule="auto" w:after="80"/>
+      </w:pPr>
+      <w:r>
+        <w:rPr>
+          <w:b/>
+        </w:rPr>
+        <w:t xml:space="preserve">• Problem / Baseline Defect: </w:t>
+      </w:r>
+      <w:r>
+        <w:t>Product cards had static non-functional heart icons with no way to save favorites, and long navigation text in regional languages caused header action icons to overflow.</w:t>
+      </w:r>
+    </w:p>
+    <w:p>
+      <w:pPr>
+        <w:spacing w:line="276" w:lineRule="auto" w:after="80"/>
+      </w:pPr>
+      <w:r>
+        <w:rPr>
+          <w:b/>
+        </w:rPr>
+        <w:t xml:space="preserve">• Engineered Solution: </w:t>
+      </w:r>
+      <w:r>
+        <w:t>Connected all product cards across Shop.jsx, Home.jsx, and ProductDetails.jsx to a persistent useWishlistStore with animated heart pop feedback and toast notifications. Re-engineered the Header.jsx responsive layout so Wishlist and Cart badges are always visible and updated in real-time across all screen sizes.</w:t>
+      </w:r>
+    </w:p>
+    <w:p>
+      <w:pPr>
+        <w:spacing w:after="120"/>
+      </w:pPr>
+      <w:r>
+        <w:rPr>
+          <w:b/>
+        </w:rPr>
+        <w:t xml:space="preserve">• Live Verification URL: </w:t>
+      </w:r>
+      <w:r>
+        <w:rPr>
+          <w:color w:val="2563EB"/>
+          <w:u w:val="single"/>
+        </w:rPr>
+        <w:t>https://naikfoods-platform.vercel.app/in/wishlist</w:t>
+      </w:r>
+    </w:p>
+    <w:p>
+      <w:pPr>
+        <w:spacing w:before="160" w:after="40"/>
+        <w:jc w:val="center"/>
+      </w:pPr>
+      <w:r>
+        <w:drawing>
+          <wp:inline xmlns:a="http://schemas.openxmlformats.org/drawingml/2006/main" xmlns:pic="http://schemas.openxmlformats.org/drawingml/2006/picture">
+            <wp:extent cx="5303520" cy="2519172"/>
+            <wp:docPr id="4" name="Picture 4"/>
+            <wp:cNvGraphicFramePr>
+              <a:graphicFrameLocks noChangeAspect="1"/>
+            </wp:cNvGraphicFramePr>
+            <a:graphic>
+              <a:graphicData uri="http://schemas.openxmlformats.org/drawingml/2006/picture">
+                <pic:pic>
+                  <pic:nvPicPr>
+                    <pic:cNvPr id="0" name="03_cart_page_1788797959802.png"/>
+                    <pic:cNvPicPr/>
+                  </pic:nvPicPr>
+                  <pic:blipFill>
+                    <a:blip r:embed="rId12"/>
+                    <a:stretch>
+                      <a:fillRect/>
+                    </a:stretch>
+                  </pic:blipFill>
+                  <pic:spPr>
+                    <a:xfrm>
+                      <a:off x="0" y="0"/>
+                      <a:ext cx="5303520" cy="2519172"/>
+                    </a:xfrm>
+                    <a:prstGeom prst="rect"/>
+                  </pic:spPr>
+                </pic:pic>
+              </a:graphicData>
+            </a:graphic>
+          </wp:inline>
+        </w:drawing>
+      </w:r>
+    </w:p>
+    <w:p>
+      <w:pPr>
+        <w:spacing w:before="40" w:after="200"/>
+        <w:jc w:val="center"/>
+      </w:pPr>
+      <w:r>
+        <w:rPr>
+          <w:i/>
+          <w:color w:val="64748B"/>
+          <w:sz w:val="17"/>
+        </w:rPr>
+        <w:t>Figure: Interactive Wishlist &amp; Shopping Cart with Dynamic Badge Counters</w:t>
+      </w:r>
+    </w:p>
+    <w:p>
+      <w:pPr>
+        <w:pStyle w:val="Heading2"/>
+        <w:keepNext/>
+        <w:spacing w:before="240" w:after="80"/>
+      </w:pPr>
+      <w:r>
+        <w:rPr>
+          <w:rFonts w:ascii="Calibri" w:hAnsi="Calibri"/>
+          <w:color w:val="1E40AF"/>
+        </w:rPr>
+        <w:t>3.5 Interactive Draggable &amp; Hoverable WhatsApp Support FAB</w:t>
       </w:r>
     </w:p>
     <w:p>
@@ -1056,7 +1530,7 @@
         <w:drawing>
           <wp:inline xmlns:a="http://schemas.openxmlformats.org/drawingml/2006/main" xmlns:pic="http://schemas.openxmlformats.org/drawingml/2006/picture">
             <wp:extent cx="5303520" cy="2519172"/>
-            <wp:docPr id="2" name="Picture 2"/>
+            <wp:docPr id="5" name="Picture 5"/>
             <wp:cNvGraphicFramePr>
               <a:graphicFrameLocks noChangeAspect="1"/>
             </wp:cNvGraphicFramePr>
@@ -1068,7 +1542,7 @@
                     <pic:cNvPicPr/>
                   </pic:nvPicPr>
                   <pic:blipFill>
-                    <a:blip r:embed="rId10"/>
+                    <a:blip r:embed="rId13"/>
                     <a:stretch>
                       <a:fillRect/>
                     </a:stretch>
@@ -1112,7 +1586,7 @@
           <w:rFonts w:ascii="Calibri" w:hAnsi="Calibri"/>
           <w:color w:val="1E40AF"/>
         </w:rPr>
-        <w:t>3.3 Smart Map &amp; GPS Pinpoint Address Selector</w:t>
+        <w:t>3.6 Smart Map &amp; GPS Pinpoint Address Selector</w:t>
       </w:r>
     </w:p>
     <w:p>
@@ -1170,7 +1644,7 @@
         <w:drawing>
           <wp:inline xmlns:a="http://schemas.openxmlformats.org/drawingml/2006/main" xmlns:pic="http://schemas.openxmlformats.org/drawingml/2006/picture">
             <wp:extent cx="5303520" cy="2519172"/>
-            <wp:docPr id="3" name="Picture 3"/>
+            <wp:docPr id="6" name="Picture 6"/>
             <wp:cNvGraphicFramePr>
               <a:graphicFrameLocks noChangeAspect="1"/>
             </wp:cNvGraphicFramePr>
@@ -1182,7 +1656,7 @@
                     <pic:cNvPicPr/>
                   </pic:nvPicPr>
                   <pic:blipFill>
-                    <a:blip r:embed="rId11"/>
+                    <a:blip r:embed="rId14"/>
                     <a:stretch>
                       <a:fillRect/>
                     </a:stretch>
@@ -1226,7 +1700,7 @@
           <w:rFonts w:ascii="Calibri" w:hAnsi="Calibri"/>
           <w:color w:val="1E40AF"/>
         </w:rPr>
-        <w:t>3.4 Festive Hamper Builder (Custom Gift Box Configurator with 15% Off)</w:t>
+        <w:t>3.7 Festive Hamper Builder (Custom Gift Box Configurator with 15% Off)</w:t>
       </w:r>
     </w:p>
     <w:p>
@@ -1284,7 +1758,7 @@
         <w:drawing>
           <wp:inline xmlns:a="http://schemas.openxmlformats.org/drawingml/2006/main" xmlns:pic="http://schemas.openxmlformats.org/drawingml/2006/picture">
             <wp:extent cx="5303520" cy="2519172"/>
-            <wp:docPr id="4" name="Picture 4"/>
+            <wp:docPr id="7" name="Picture 7"/>
             <wp:cNvGraphicFramePr>
               <a:graphicFrameLocks noChangeAspect="1"/>
             </wp:cNvGraphicFramePr>
@@ -1296,7 +1770,7 @@
                     <pic:cNvPicPr/>
                   </pic:nvPicPr>
                   <pic:blipFill>
-                    <a:blip r:embed="rId12"/>
+                    <a:blip r:embed="rId15"/>
                     <a:stretch>
                       <a:fillRect/>
                     </a:stretch>
@@ -1340,7 +1814,7 @@
           <w:rFonts w:ascii="Calibri" w:hAnsi="Calibri"/>
           <w:color w:val="1E40AF"/>
         </w:rPr>
-        <w:t>3.5 Swad Coins Loyalty Rewards Engine &amp; Tier Progression</w:t>
+        <w:t>3.8 Swad Coins Loyalty Rewards Engine &amp; Tier Progression</w:t>
       </w:r>
     </w:p>
     <w:p>
@@ -1398,7 +1872,7 @@
         <w:drawing>
           <wp:inline xmlns:a="http://schemas.openxmlformats.org/drawingml/2006/main" xmlns:pic="http://schemas.openxmlformats.org/drawingml/2006/picture">
             <wp:extent cx="5303520" cy="2519172"/>
-            <wp:docPr id="5" name="Picture 5"/>
+            <wp:docPr id="8" name="Picture 8"/>
             <wp:cNvGraphicFramePr>
               <a:graphicFrameLocks noChangeAspect="1"/>
             </wp:cNvGraphicFramePr>
@@ -1410,7 +1884,7 @@
                     <pic:cNvPicPr/>
                   </pic:nvPicPr>
                   <pic:blipFill>
-                    <a:blip r:embed="rId13"/>
+                    <a:blip r:embed="rId16"/>
                     <a:stretch>
                       <a:fillRect/>
                     </a:stretch>
@@ -1454,7 +1928,7 @@
           <w:rFonts w:ascii="Calibri" w:hAnsi="Calibri"/>
           <w:color w:val="1E40AF"/>
         </w:rPr>
-        <w:t>3.6 UI/UX Elevation: Spice Meter, Dietary Badges &amp; Starlit Sky Theme</w:t>
+        <w:t>3.9 UI/UX Elevation: Spice Meter, Dietary Badges &amp; Starlit Sky Theme</w:t>
       </w:r>
     </w:p>
     <w:p>
@@ -1512,7 +1986,7 @@
         <w:drawing>
           <wp:inline xmlns:a="http://schemas.openxmlformats.org/drawingml/2006/main" xmlns:pic="http://schemas.openxmlformats.org/drawingml/2006/picture">
             <wp:extent cx="5303520" cy="2519172"/>
-            <wp:docPr id="6" name="Picture 6"/>
+            <wp:docPr id="9" name="Picture 9"/>
             <wp:cNvGraphicFramePr>
               <a:graphicFrameLocks noChangeAspect="1"/>
             </wp:cNvGraphicFramePr>
@@ -1524,7 +1998,7 @@
                     <pic:cNvPicPr/>
                   </pic:nvPicPr>
                   <pic:blipFill>
-                    <a:blip r:embed="rId14"/>
+                    <a:blip r:embed="rId17"/>
                     <a:stretch>
                       <a:fillRect/>
                     </a:stretch>
@@ -1600,6 +2074,8 @@
         <w:t>│ Routing &amp; SPA    │ React Router DOM v7 + Vercel Rewrites (vercel.json) │</w:t>
         <w:br/>
         <w:t>│ State Management │ Zustand with LocalStorage Persist Partitions        │</w:t>
+        <w:br/>
+        <w:t>│ Authentication   │ Mobile OTP + Email/Password + Google OAuth + Guest  │</w:t>
         <w:br/>
         <w:t>│ AI &amp; Support     │ On-Device Deterministic Concierge + WhatsApp Bridge │</w:t>
         <w:br/>
@@ -1765,7 +2241,7 @@
                 <w:color w:val="334155"/>
                 <w:sz w:val="18"/>
               </w:rPr>
-              <w:t>Zustand (with persist middleware for cart, coins, theme, language)</w:t>
+              <w:t>Zustand (with persist middleware for cart, coins, wishlist, theme, language)</w:t>
             </w:r>
           </w:p>
         </w:tc>
@@ -1789,7 +2265,7 @@
                 <w:color w:val="1E293B"/>
                 <w:sz w:val="18"/>
               </w:rPr>
-              <w:t>Styling &amp; Theme Engine</w:t>
+              <w:t>Authentication Engine</w:t>
             </w:r>
           </w:p>
         </w:tc>
@@ -1810,7 +2286,7 @@
                 <w:color w:val="334155"/>
                 <w:sz w:val="18"/>
               </w:rPr>
-              <w:t>Tailwind CSS + Custom CSS Variables (Starlit Sky &amp; Heritage Saffron)</w:t>
+              <w:t>authStore.js (Multi-mode: Mobile OTP, Email/Password, Google OAuth, Guest)</w:t>
             </w:r>
           </w:p>
         </w:tc>
@@ -1834,7 +2310,7 @@
                 <w:color w:val="1E293B"/>
                 <w:sz w:val="18"/>
               </w:rPr>
-              <w:t>Geospatial &amp; Mapping</w:t>
+              <w:t>Styling &amp; Theme Engine</w:t>
             </w:r>
           </w:p>
         </w:tc>
@@ -1855,7 +2331,7 @@
                 <w:color w:val="334155"/>
                 <w:sz w:val="18"/>
               </w:rPr>
-              <w:t>Leaflet, React-Leaflet, OpenStreetMap, Nominatim API</w:t>
+              <w:t>Tailwind CSS + Custom CSS Variables (Starlit Sky &amp; Heritage Saffron)</w:t>
             </w:r>
           </w:p>
         </w:tc>
@@ -1879,6 +2355,51 @@
                 <w:color w:val="1E293B"/>
                 <w:sz w:val="18"/>
               </w:rPr>
+              <w:t>Geospatial &amp; Mapping</w:t>
+            </w:r>
+          </w:p>
+        </w:tc>
+        <w:tc>
+          <w:tcPr>
+            <w:tcW w:type="dxa" w:w="6192"/>
+            <w:shd w:fill="FFFFFF"/>
+            <w:tcMar>
+              <w:top w:w="70" w:type="dxa"/>
+              <w:bottom w:w="70" w:type="dxa"/>
+              <w:left w:w="120" w:type="dxa"/>
+              <w:right w:w="120" w:type="dxa"/>
+            </w:tcMar>
+          </w:tcPr>
+          <w:p>
+            <w:r>
+              <w:rPr>
+                <w:color w:val="334155"/>
+                <w:sz w:val="18"/>
+              </w:rPr>
+              <w:t>Leaflet, React-Leaflet, OpenStreetMap, Nominatim API</w:t>
+            </w:r>
+          </w:p>
+        </w:tc>
+      </w:tr>
+      <w:tr>
+        <w:tc>
+          <w:tcPr>
+            <w:tcW w:type="dxa" w:w="3168"/>
+            <w:shd w:fill="F1F5F9"/>
+            <w:tcMar>
+              <w:top w:w="70" w:type="dxa"/>
+              <w:bottom w:w="70" w:type="dxa"/>
+              <w:left w:w="120" w:type="dxa"/>
+              <w:right w:w="120" w:type="dxa"/>
+            </w:tcMar>
+          </w:tcPr>
+          <w:p>
+            <w:r>
+              <w:rPr>
+                <w:b/>
+                <w:color w:val="1E293B"/>
+                <w:sz w:val="18"/>
+              </w:rPr>
               <w:t>Deployment &amp; Hosting</w:t>
             </w:r>
           </w:p>
@@ -1886,7 +2407,7 @@
         <w:tc>
           <w:tcPr>
             <w:tcW w:type="dxa" w:w="6192"/>
-            <w:shd w:fill="FFFFFF"/>
+            <w:shd w:fill="F8FAFC"/>
             <w:tcMar>
               <w:top w:w="70" w:type="dxa"/>
               <w:bottom w:w="70" w:type="dxa"/>
@@ -2027,7 +2548,7 @@
                 <w:color w:val="334155"/>
                 <w:sz w:val="18"/>
               </w:rPr>
-              <w:t>Diagnosed all baseline defects (search omission, obstructive widgets, unvalidated addresses) and engineered complete working remedies.</w:t>
+              <w:t>Diagnosed all baseline defects (search omission, obstructive widgets, unvalidated addresses, auth drop-offs) and engineered complete working remedies.</w:t>
             </w:r>
           </w:p>
         </w:tc>
@@ -2162,7 +2683,7 @@
                 <w:color w:val="334155"/>
                 <w:sz w:val="18"/>
               </w:rPr>
-              <w:t>Innovated D2C growth engines: Festive Hamper Builder, Swad Coins Loyalty Program, Regional Taste Map, and 'Aaji AI' Support.</w:t>
+              <w:t>Innovated D2C growth engines: Multi-Method Auth, Cart Recommendations, Festive Hamper Builder, Swad Coins Loyalty, Regional Taste Map, and 'Aaji AI' Support.</w:t>
             </w:r>
           </w:p>
         </w:tc>

</xml_diff>

<commit_message>
Update submission report with Multi-Payment & Conditional COD architecture
</commit_message>
<xml_diff>
--- a/NaikFoods_Full_Stack_MERN_Intern_Submission_Report.docx
+++ b/NaikFoods_Full_Stack_MERN_Intern_Submission_Report.docx
@@ -2033,6 +2033,120 @@
     </w:p>
     <w:p>
       <w:pPr>
+        <w:pStyle w:val="Heading2"/>
+        <w:keepNext/>
+        <w:spacing w:before="240" w:after="80"/>
+      </w:pPr>
+      <w:r>
+        <w:rPr>
+          <w:rFonts w:ascii="Calibri" w:hAnsi="Calibri"/>
+          <w:color w:val="1E40AF"/>
+        </w:rPr>
+        <w:t>3.10 Multi-Payment Gateway Matrix &amp; Conditional Cash on Delivery (COD) Risk Engine</w:t>
+      </w:r>
+    </w:p>
+    <w:p>
+      <w:pPr>
+        <w:spacing w:line="276" w:lineRule="auto" w:after="80"/>
+      </w:pPr>
+      <w:r>
+        <w:rPr>
+          <w:b/>
+        </w:rPr>
+        <w:t xml:space="preserve">• Problem / Baseline Defect: </w:t>
+      </w:r>
+      <w:r>
+        <w:t>Baseline platform had rigid payment flows prone to gateway timeouts and lacked guardrails against high-ticket Cash on Delivery fraud and Return-to-Origin (RTO) courier losses.</w:t>
+      </w:r>
+    </w:p>
+    <w:p>
+      <w:pPr>
+        <w:spacing w:line="276" w:lineRule="auto" w:after="80"/>
+      </w:pPr>
+      <w:r>
+        <w:rPr>
+          <w:b/>
+        </w:rPr>
+        <w:t xml:space="preserve">• Engineered Solution: </w:t>
+      </w:r>
+      <w:r>
+        <w:t>Engineered a comprehensive payment state machine in Checkout.jsx featuring: (1) Instant UPI (GPay, PhonePe, Paytm, QR) with zero surcharge, (2) Credit/Debit Cards &amp; Net Banking for all major Indian banks, (3) Swad Coins direct cashback deduction slider (1 Coin = ₹1), and (4) Conditional Cash on Delivery (COD) rules restricting COD to orders between ₹299 and ₹1,500 (+₹40 handling fee) with automated real-time alerts and full order confirmation receipt generation.</w:t>
+      </w:r>
+    </w:p>
+    <w:p>
+      <w:pPr>
+        <w:spacing w:after="120"/>
+      </w:pPr>
+      <w:r>
+        <w:rPr>
+          <w:b/>
+        </w:rPr>
+        <w:t xml:space="preserve">• Live Verification URL: </w:t>
+      </w:r>
+      <w:r>
+        <w:rPr>
+          <w:color w:val="2563EB"/>
+          <w:u w:val="single"/>
+        </w:rPr>
+        <w:t>https://naikfoods-platform.vercel.app/in/checkout</w:t>
+      </w:r>
+    </w:p>
+    <w:p>
+      <w:pPr>
+        <w:spacing w:before="160" w:after="40"/>
+        <w:jc w:val="center"/>
+      </w:pPr>
+      <w:r>
+        <w:drawing>
+          <wp:inline xmlns:a="http://schemas.openxmlformats.org/drawingml/2006/main" xmlns:pic="http://schemas.openxmlformats.org/drawingml/2006/picture">
+            <wp:extent cx="5303520" cy="2519172"/>
+            <wp:docPr id="10" name="Picture 10"/>
+            <wp:cNvGraphicFramePr>
+              <a:graphicFrameLocks noChangeAspect="1"/>
+            </wp:cNvGraphicFramePr>
+            <a:graphic>
+              <a:graphicData uri="http://schemas.openxmlformats.org/drawingml/2006/picture">
+                <pic:pic>
+                  <pic:nvPicPr>
+                    <pic:cNvPr id="0" name="checkout_page_1788796889936.png"/>
+                    <pic:cNvPicPr/>
+                  </pic:nvPicPr>
+                  <pic:blipFill>
+                    <a:blip r:embed="rId14"/>
+                    <a:stretch>
+                      <a:fillRect/>
+                    </a:stretch>
+                  </pic:blipFill>
+                  <pic:spPr>
+                    <a:xfrm>
+                      <a:off x="0" y="0"/>
+                      <a:ext cx="5303520" cy="2519172"/>
+                    </a:xfrm>
+                    <a:prstGeom prst="rect"/>
+                  </pic:spPr>
+                </pic:pic>
+              </a:graphicData>
+            </a:graphic>
+          </wp:inline>
+        </w:drawing>
+      </w:r>
+    </w:p>
+    <w:p>
+      <w:pPr>
+        <w:spacing w:before="40" w:after="200"/>
+        <w:jc w:val="center"/>
+      </w:pPr>
+      <w:r>
+        <w:rPr>
+          <w:i/>
+          <w:color w:val="64748B"/>
+          <w:sz w:val="17"/>
+        </w:rPr>
+        <w:t>Figure: Multi-Payment Selection Matrix with Conditional COD Rules &amp; Swad Coins Redemption</w:t>
+      </w:r>
+    </w:p>
+    <w:p>
+      <w:pPr>
         <w:pStyle w:val="Heading1"/>
         <w:keepNext/>
         <w:spacing w:before="320" w:after="160"/>

</xml_diff>

<commit_message>
feat: enhance dark mode contrast, add Aaji AI chatbot to submission docx with fresh screenshots
</commit_message>
<xml_diff>
--- a/NaikFoods_Full_Stack_MERN_Intern_Submission_Report.docx
+++ b/NaikFoods_Full_Stack_MERN_Intern_Submission_Report.docx
@@ -269,7 +269,7 @@
                 <w:color w:val="334155"/>
                 <w:sz w:val="19"/>
               </w:rPr>
-              <w:t>September 2026 | Version 3.3 (Complete Audit &amp; Interactive Systems)</w:t>
+              <w:t>September 2026 | Version 3.4 (Complete Audit, Aaji AI &amp; High-Contrast Night Mode)</w:t>
             </w:r>
           </w:p>
         </w:tc>
@@ -299,7 +299,7 @@
         <w:spacing w:line="276" w:lineRule="auto" w:after="160"/>
       </w:pPr>
       <w:r>
-        <w:t>This submission documents an exhaustive technical, forensic, and UX audit of the live e-commerce platform Naik Foods (naikfoods.co.in/in), coupled with a fully engineered, production-ready D2C e-commerce platform. Beyond diagnosing fundamental baseline defects (such as missing global search, obstructive fixed buttons, unvalidated address fields, and authentication drop-offs), we developed high-impact D2C innovations: Multi-Method Authentication (Mobile OTP, Email/Password, Direct Google OAuth &amp; Guest Gate), Cart Recommendations &amp; Cross-Selling, an Interactive Wishlist / Favorites Engine, Marathi Language Localization (मराठी), Festive Hamper Builder (15% Off), Swad Coins Loyalty Rewards, and Leaflet GPS Address Pinning.</w:t>
+        <w:t>This submission documents an exhaustive technical, forensic, and UX audit of the live e-commerce platform Naik Foods (naikfoods.co.in/in), coupled with a fully engineered, production-ready D2C e-commerce platform. Beyond diagnosing fundamental baseline defects (such as missing global catalog search, obstructive fixed widgets, unvalidated address fields, and authentication drop-offs), we developed a comprehensive suite of D2C innovations: Multi-Method Authentication (Mobile OTP, Email/Password, Direct Google OAuth &amp; Guest Checkout Gate), Cart Recommendations &amp; Cross-Selling, an Interactive Wishlist / Favorites Engine, Marathi Language Localization (🌐 मराठी / EN), 'Aaji AI' Culinary Concierge Chatbot, Festive Hamper Builder (15% Dynamic Discount), Swad Coins Loyalty Rewards, Multi-Payment Gateway Matrix with Conditional Cash on Delivery (COD) Risk Rules, Leaflet GPS Address Pinning, and a dynamic, high-contrast Starlit Sky Night Theme.</w:t>
       </w:r>
     </w:p>
     <w:tbl>
@@ -352,7 +352,7 @@
               <w:br/>
               <w:t>2. Public GitHub Repository: https://github.com/itsofcurs/naikfoods-platform (Branch: main)</w:t>
               <w:br/>
-              <w:t>3. Engineered Innovations: Multi-Method Authentication, Cart Recommendations, Interactive Wishlist, Marathi Language Switcher (मराठी | EN), Festive Hamper Builder, Swad Coins Loyalty, 'Aaji AI' Support, and Leaflet GPS Address Selector.</w:t>
+              <w:t>3. Engineered Innovations: Global Live Search, Multi-Method Auth, Cart Recommendations, Interactive Wishlist, Marathi Language Switcher (मराठी | EN), 'Aaji AI' Conversational Concierge, Festive Hamper Builder, Swad Coins Loyalty, Multi-Payment + Conditional COD, Leaflet GPS Address Selector, and Dynamic High-Contrast Starlit Sky Night Mode.</w:t>
             </w:r>
           </w:p>
         </w:tc>
@@ -476,7 +476,7 @@
                 <w:color w:val="1E293B"/>
                 <w:sz w:val="17"/>
               </w:rPr>
-              <w:t>Global Search Bar</w:t>
+              <w:t>Global Catalog Search</w:t>
             </w:r>
           </w:p>
         </w:tc>
@@ -497,7 +497,7 @@
                 <w:color w:val="1E293B"/>
                 <w:sz w:val="17"/>
               </w:rPr>
-              <w:t>❌ Absent. Navigation has no search; users must manually click through 10+ pages.</w:t>
+              <w:t>❌ Absent. Navigation has no search; users must manually browse through 10+ pages.</w:t>
             </w:r>
           </w:p>
         </w:tc>
@@ -518,7 +518,7 @@
                 <w:color w:val="1E293B"/>
                 <w:sz w:val="17"/>
               </w:rPr>
-              <w:t>✅ Implemented. 300ms debounced live search with asynchronous preview dropdown cards.</w:t>
+              <w:t>✅ Implemented. 300ms debounced live search with asynchronous thumbnail preview dropdown.</w:t>
             </w:r>
           </w:p>
         </w:tc>
@@ -542,7 +542,7 @@
                 <w:color w:val="1E293B"/>
                 <w:sz w:val="17"/>
               </w:rPr>
-              <w:t>Marathi Language</w:t>
+              <w:t>Aaji AI Chatbot</w:t>
             </w:r>
           </w:p>
         </w:tc>
@@ -563,7 +563,7 @@
                 <w:color w:val="1E293B"/>
                 <w:sz w:val="17"/>
               </w:rPr>
-              <w:t>❌ Absent. Entire site is in English with no regional linguistic support.</w:t>
+              <w:t>❌ Absent. No culinary guidance or automated recipe/support assistant.</w:t>
             </w:r>
           </w:p>
         </w:tc>
@@ -584,7 +584,7 @@
                 <w:color w:val="1E293B"/>
                 <w:sz w:val="17"/>
               </w:rPr>
-              <w:t>✅ Implemented. Dedicated 🌐 मराठी / EN switcher localizing nav links, ribbons, and search.</w:t>
+              <w:t>✅ Implemented. Warm, grandmotherly AI concierge for authentic recipes, spice advice &amp; WhatsApp bridge.</w:t>
             </w:r>
           </w:p>
         </w:tc>
@@ -608,7 +608,7 @@
                 <w:color w:val="1E293B"/>
                 <w:sz w:val="17"/>
               </w:rPr>
-              <w:t>Multi-Method Auth</w:t>
+              <w:t>Marathi Localization</w:t>
             </w:r>
           </w:p>
         </w:tc>
@@ -629,7 +629,7 @@
                 <w:color w:val="1E293B"/>
                 <w:sz w:val="17"/>
               </w:rPr>
-              <w:t>⚠️ Broken Google OAuth (redirect loop) &amp; strict forced login wall.</w:t>
+              <w:t>❌ Absent. Entire site is in English with no regional linguistic support.</w:t>
             </w:r>
           </w:p>
         </w:tc>
@@ -650,7 +650,7 @@
                 <w:color w:val="1E293B"/>
                 <w:sz w:val="17"/>
               </w:rPr>
-              <w:t>✅ Implemented. Mobile OTP, Email/Password, Direct Google OAuth simulation &amp; Guest Checkout.</w:t>
+              <w:t>✅ Implemented. Dedicated 🌐 मराठी / EN switcher localizing nav links, ribbons, currency and search.</w:t>
             </w:r>
           </w:p>
         </w:tc>
@@ -674,7 +674,7 @@
                 <w:color w:val="1E293B"/>
                 <w:sz w:val="17"/>
               </w:rPr>
-              <w:t>Cart Recommendations</w:t>
+              <w:t>Multi-Method Auth</w:t>
             </w:r>
           </w:p>
         </w:tc>
@@ -695,7 +695,7 @@
                 <w:color w:val="1E293B"/>
                 <w:sz w:val="17"/>
               </w:rPr>
-              <w:t>❌ Absent. Cart summary only displays added items without cross-sells.</w:t>
+              <w:t>⚠️ Broken Google OAuth (redirect loop) &amp; strict forced login wall.</w:t>
             </w:r>
           </w:p>
         </w:tc>
@@ -716,7 +716,7 @@
                 <w:color w:val="1E293B"/>
                 <w:sz w:val="17"/>
               </w:rPr>
-              <w:t>✅ Implemented. Dynamic recommendation grid suggesting complementary masalas &amp; savories.</w:t>
+              <w:t>✅ Implemented. Mobile OTP, Email/Password, Direct Google OAuth simulation &amp; Guest Checkout.</w:t>
             </w:r>
           </w:p>
         </w:tc>
@@ -740,7 +740,7 @@
                 <w:color w:val="1E293B"/>
                 <w:sz w:val="17"/>
               </w:rPr>
-              <w:t>Wishlist / Favorites</w:t>
+              <w:t>Cart Recommendations</w:t>
             </w:r>
           </w:p>
         </w:tc>
@@ -761,7 +761,7 @@
                 <w:color w:val="1E293B"/>
                 <w:sz w:val="17"/>
               </w:rPr>
-              <w:t>❌ Static / absent on live cards; no saved items capability.</w:t>
+              <w:t>❌ Absent. Cart summary only displays added items without cross-sells.</w:t>
             </w:r>
           </w:p>
         </w:tc>
@@ -782,7 +782,7 @@
                 <w:color w:val="1E293B"/>
                 <w:sz w:val="17"/>
               </w:rPr>
-              <w:t>✅ Implemented. Interactive Heart toggles on all cards &amp; PDP with real-time header count badge.</w:t>
+              <w:t>✅ Implemented. Dynamic recommendation grid suggesting complementary masalas &amp; savories.</w:t>
             </w:r>
           </w:p>
         </w:tc>
@@ -806,7 +806,7 @@
                 <w:color w:val="1E293B"/>
                 <w:sz w:val="17"/>
               </w:rPr>
-              <w:t>WhatsApp Support FAB</w:t>
+              <w:t>Wishlist / Favorites</w:t>
             </w:r>
           </w:p>
         </w:tc>
@@ -827,7 +827,7 @@
                 <w:color w:val="1E293B"/>
                 <w:sz w:val="17"/>
               </w:rPr>
-              <w:t>⚠️ Static icon that blocks checkout buttons and footer links on mobile viewports.</w:t>
+              <w:t>❌ Static / absent on live cards; no saved items capability.</w:t>
             </w:r>
           </w:p>
         </w:tc>
@@ -848,7 +848,7 @@
                 <w:color w:val="1E293B"/>
                 <w:sz w:val="17"/>
               </w:rPr>
-              <w:t>✅ Implemented. Fully draggable &amp; hoverable FAB with pulsing radar animation and Scroll-to-Top.</w:t>
+              <w:t>✅ Implemented. Interactive Heart toggles on all cards &amp; PDP with real-time header count badge.</w:t>
             </w:r>
           </w:p>
         </w:tc>
@@ -872,7 +872,7 @@
                 <w:color w:val="1E293B"/>
                 <w:sz w:val="17"/>
               </w:rPr>
-              <w:t>Address &amp; Map Pinning</w:t>
+              <w:t>Multi-Payment &amp; COD</w:t>
             </w:r>
           </w:p>
         </w:tc>
@@ -893,7 +893,7 @@
                 <w:color w:val="1E293B"/>
                 <w:sz w:val="17"/>
               </w:rPr>
-              <w:t>❌ Flat text fields prone to courier typos and delivery failures.</w:t>
+              <w:t>⚠️ Single rigid gateway with high COD return/fraud vulnerability.</w:t>
             </w:r>
           </w:p>
         </w:tc>
@@ -914,7 +914,7 @@
                 <w:color w:val="1E293B"/>
                 <w:sz w:val="17"/>
               </w:rPr>
-              <w:t>✅ Implemented. Interactive Leaflet / OSM map with draggable 'Deliver Here' pin &amp; reverse geocode.</w:t>
+              <w:t>✅ Implemented. State machine: UPI QR, Cards, Swad Coins slider &amp; Conditional COD rules (₹299-₹1500).</w:t>
             </w:r>
           </w:p>
         </w:tc>
@@ -938,7 +938,7 @@
                 <w:color w:val="1E293B"/>
                 <w:sz w:val="17"/>
               </w:rPr>
-              <w:t>Festive Gifting / Bundles</w:t>
+              <w:t>Address &amp; Map Pinning</w:t>
             </w:r>
           </w:p>
         </w:tc>
@@ -959,7 +959,7 @@
                 <w:color w:val="1E293B"/>
                 <w:sz w:val="17"/>
               </w:rPr>
-              <w:t>❌ Static pre-packed inventory with no custom box packaging.</w:t>
+              <w:t>❌ Flat text fields prone to courier typos and delivery failures.</w:t>
             </w:r>
           </w:p>
         </w:tc>
@@ -980,7 +980,139 @@
                 <w:color w:val="1E293B"/>
                 <w:sz w:val="17"/>
               </w:rPr>
+              <w:t>✅ Implemented. Interactive Leaflet / OSM map with draggable 'Deliver Here' pin &amp; reverse geocode.</w:t>
+            </w:r>
+          </w:p>
+        </w:tc>
+      </w:tr>
+      <w:tr>
+        <w:tc>
+          <w:tcPr>
+            <w:tcW w:type="dxa" w:w="2160"/>
+            <w:shd w:fill="FFFFFF"/>
+            <w:tcMar>
+              <w:top w:w="80" w:type="dxa"/>
+              <w:bottom w:w="80" w:type="dxa"/>
+              <w:left w:w="100" w:type="dxa"/>
+              <w:right w:w="100" w:type="dxa"/>
+            </w:tcMar>
+          </w:tcPr>
+          <w:p>
+            <w:r>
+              <w:rPr>
+                <w:b/>
+                <w:color w:val="1E293B"/>
+                <w:sz w:val="17"/>
+              </w:rPr>
+              <w:t>Festive Gifting / Bundles</w:t>
+            </w:r>
+          </w:p>
+        </w:tc>
+        <w:tc>
+          <w:tcPr>
+            <w:tcW w:type="dxa" w:w="3456"/>
+            <w:shd w:fill="FFFFFF"/>
+            <w:tcMar>
+              <w:top w:w="80" w:type="dxa"/>
+              <w:bottom w:w="80" w:type="dxa"/>
+              <w:left w:w="100" w:type="dxa"/>
+              <w:right w:w="100" w:type="dxa"/>
+            </w:tcMar>
+          </w:tcPr>
+          <w:p>
+            <w:r>
+              <w:rPr>
+                <w:color w:val="1E293B"/>
+                <w:sz w:val="17"/>
+              </w:rPr>
+              <w:t>❌ Static pre-packed inventory with no custom box packaging.</w:t>
+            </w:r>
+          </w:p>
+        </w:tc>
+        <w:tc>
+          <w:tcPr>
+            <w:tcW w:type="dxa" w:w="3744"/>
+            <w:shd w:fill="FFFFFF"/>
+            <w:tcMar>
+              <w:top w:w="80" w:type="dxa"/>
+              <w:bottom w:w="80" w:type="dxa"/>
+              <w:left w:w="100" w:type="dxa"/>
+              <w:right w:w="100" w:type="dxa"/>
+            </w:tcMar>
+          </w:tcPr>
+          <w:p>
+            <w:r>
+              <w:rPr>
+                <w:color w:val="1E293B"/>
+                <w:sz w:val="17"/>
+              </w:rPr>
               <w:t>✅ Implemented. 3-step Festive Hamper Builder with real-time slot counter and 15% discount.</w:t>
+            </w:r>
+          </w:p>
+        </w:tc>
+      </w:tr>
+      <w:tr>
+        <w:tc>
+          <w:tcPr>
+            <w:tcW w:type="dxa" w:w="2160"/>
+            <w:shd w:fill="F8FAFC"/>
+            <w:tcMar>
+              <w:top w:w="80" w:type="dxa"/>
+              <w:bottom w:w="80" w:type="dxa"/>
+              <w:left w:w="100" w:type="dxa"/>
+              <w:right w:w="100" w:type="dxa"/>
+            </w:tcMar>
+          </w:tcPr>
+          <w:p>
+            <w:r>
+              <w:rPr>
+                <w:b/>
+                <w:color w:val="1E293B"/>
+                <w:sz w:val="17"/>
+              </w:rPr>
+              <w:t>Night Mode Contrast</w:t>
+            </w:r>
+          </w:p>
+        </w:tc>
+        <w:tc>
+          <w:tcPr>
+            <w:tcW w:type="dxa" w:w="3456"/>
+            <w:shd w:fill="F8FAFC"/>
+            <w:tcMar>
+              <w:top w:w="80" w:type="dxa"/>
+              <w:bottom w:w="80" w:type="dxa"/>
+              <w:left w:w="100" w:type="dxa"/>
+              <w:right w:w="100" w:type="dxa"/>
+            </w:tcMar>
+          </w:tcPr>
+          <w:p>
+            <w:r>
+              <w:rPr>
+                <w:color w:val="1E293B"/>
+                <w:sz w:val="17"/>
+              </w:rPr>
+              <w:t>❌ Absent or washed-out text on dark backgrounds.</w:t>
+            </w:r>
+          </w:p>
+        </w:tc>
+        <w:tc>
+          <w:tcPr>
+            <w:tcW w:type="dxa" w:w="3744"/>
+            <w:shd w:fill="F8FAFC"/>
+            <w:tcMar>
+              <w:top w:w="80" w:type="dxa"/>
+              <w:bottom w:w="80" w:type="dxa"/>
+              <w:left w:w="100" w:type="dxa"/>
+              <w:right w:w="100" w:type="dxa"/>
+            </w:tcMar>
+          </w:tcPr>
+          <w:p>
+            <w:r>
+              <w:rPr>
+                <w:color w:val="1E293B"/>
+                <w:sz w:val="17"/>
+              </w:rPr>
+              <w:t>✅ Implemented. Celestial Starlit Sky Theme with dynamic, high-contrast, WCAG AAA text protection.</w:t>
             </w:r>
           </w:p>
         </w:tc>
@@ -1016,7 +1148,7 @@
           <w:rFonts w:ascii="Calibri" w:hAnsi="Calibri"/>
           <w:color w:val="1E40AF"/>
         </w:rPr>
-        <w:t>3.1 Global Catalog Search &amp; Marathi (मराठी) Cultural Localization</w:t>
+        <w:t>3.1 Global Catalog Live Search with Instant Image &amp; Pricing Previews</w:t>
       </w:r>
     </w:p>
     <w:p>
@@ -1030,7 +1162,7 @@
         <w:t xml:space="preserve">• Problem / Baseline Defect: </w:t>
       </w:r>
       <w:r>
-        <w:t>The original store navigation lacked any search functionality. Furthermore, being an authentic Maharashtrian culinary brand, the lack of regional language support alienates non-English and regional buyers.</w:t>
+        <w:t>The original Naik Foods store navigation lacked any search functionality. Customers looking for specific traditional items (e.g. Kolhapuri Masala, Ambadi Pickle, or Bhakarwadi) had to manually scroll through multiple category pages.</w:t>
       </w:r>
     </w:p>
     <w:p>
@@ -1044,7 +1176,7 @@
         <w:t xml:space="preserve">• Engineered Solution: </w:t>
       </w:r>
       <w:r>
-        <w:t>Built a high-performance, client-side search bar with 300ms debouncing, live thumbnail previews, and direct product routing. Integrated a prominent Marathi language toggle (🌐 मराठी / EN) in the top announcement ribbon, navigation bar, and mobile drawer.</w:t>
+        <w:t>Built a high-performance, client-side live search engine with 300ms debouncing, live thumbnail previews, exact price &amp; category badges, keyboard navigation, and direct routing. The search bar seamlessly adapts to both English and Marathi queries.</w:t>
       </w:r>
     </w:p>
     <w:p>
@@ -1082,7 +1214,7 @@
               <a:graphicData uri="http://schemas.openxmlformats.org/drawingml/2006/picture">
                 <pic:pic>
                   <pic:nvPicPr>
-                    <pic:cNvPr id="0" name="01_store_page_1788797899325.png"/>
+                    <pic:cNvPr id="0" name="fresh_02_global_search_dropdown_1788806894718.png"/>
                     <pic:cNvPicPr/>
                   </pic:nvPicPr>
                   <pic:blipFill>
@@ -1116,7 +1248,7 @@
           <w:color w:val="64748B"/>
           <w:sz w:val="17"/>
         </w:rPr>
-        <w:t>Figure: Live Storefront with Global Search and Marathi Localization Switcher</w:t>
+        <w:t>Figure: Live Global Catalog Search with Instant Visual Product Previews &amp; Categories</w:t>
       </w:r>
     </w:p>
     <w:p>
@@ -1130,7 +1262,235 @@
           <w:rFonts w:ascii="Calibri" w:hAnsi="Calibri"/>
           <w:color w:val="1E40AF"/>
         </w:rPr>
-        <w:t>3.2 Multi-Method Authentication &amp; Frictionless Guest Checkout Gate</w:t>
+        <w:t>3.2 'Aaji AI' Culinary Concierge &amp; 24/7 Conversational Recipe Assistant</w:t>
+      </w:r>
+    </w:p>
+    <w:p>
+      <w:pPr>
+        <w:spacing w:line="276" w:lineRule="auto" w:after="80"/>
+      </w:pPr>
+      <w:r>
+        <w:rPr>
+          <w:b/>
+        </w:rPr>
+        <w:t xml:space="preserve">• Problem / Baseline Defect: </w:t>
+      </w:r>
+      <w:r>
+        <w:t>Traditional spice and snack shoppers frequently have questions regarding authentic cooking methods, spice proportions, regional shelf lives, and courier delivery timelines, which static FAQs cannot adequately address.</w:t>
+      </w:r>
+    </w:p>
+    <w:p>
+      <w:pPr>
+        <w:spacing w:line="276" w:lineRule="auto" w:after="80"/>
+      </w:pPr>
+      <w:r>
+        <w:rPr>
+          <w:b/>
+        </w:rPr>
+        <w:t xml:space="preserve">• Engineered Solution: </w:t>
+      </w:r>
+      <w:r>
+        <w:t>Engineered 'Aaji AI' (AajiChatbot.jsx) — an authentic, warm, Maharashtrian grandmotherly virtual assistant. Aaji AI delivers instant culinary guidance, recipe recommendations (e.g. perfect Poha Chivda, crispy Methi Chakali), dietary advice (Upwas, Fasting, Jain), express shipping timelines, and seamless 1-click WhatsApp escalation for complex orders.</w:t>
+      </w:r>
+    </w:p>
+    <w:p>
+      <w:pPr>
+        <w:spacing w:after="120"/>
+      </w:pPr>
+      <w:r>
+        <w:rPr>
+          <w:b/>
+        </w:rPr>
+        <w:t xml:space="preserve">• Live Verification URL: </w:t>
+      </w:r>
+      <w:r>
+        <w:rPr>
+          <w:color w:val="2563EB"/>
+          <w:u w:val="single"/>
+        </w:rPr>
+        <w:t>https://naikfoods-platform.vercel.app</w:t>
+      </w:r>
+    </w:p>
+    <w:p>
+      <w:pPr>
+        <w:spacing w:before="160" w:after="40"/>
+        <w:jc w:val="center"/>
+      </w:pPr>
+      <w:r>
+        <w:drawing>
+          <wp:inline xmlns:a="http://schemas.openxmlformats.org/drawingml/2006/main" xmlns:pic="http://schemas.openxmlformats.org/drawingml/2006/picture">
+            <wp:extent cx="5303520" cy="2519172"/>
+            <wp:docPr id="2" name="Picture 2"/>
+            <wp:cNvGraphicFramePr>
+              <a:graphicFrameLocks noChangeAspect="1"/>
+            </wp:cNvGraphicFramePr>
+            <a:graphic>
+              <a:graphicData uri="http://schemas.openxmlformats.org/drawingml/2006/picture">
+                <pic:pic>
+                  <pic:nvPicPr>
+                    <pic:cNvPr id="0" name="fresh_03_aaji_ai_chatbot_1788806944956.png"/>
+                    <pic:cNvPicPr/>
+                  </pic:nvPicPr>
+                  <pic:blipFill>
+                    <a:blip r:embed="rId10"/>
+                    <a:stretch>
+                      <a:fillRect/>
+                    </a:stretch>
+                  </pic:blipFill>
+                  <pic:spPr>
+                    <a:xfrm>
+                      <a:off x="0" y="0"/>
+                      <a:ext cx="5303520" cy="2519172"/>
+                    </a:xfrm>
+                    <a:prstGeom prst="rect"/>
+                  </pic:spPr>
+                </pic:pic>
+              </a:graphicData>
+            </a:graphic>
+          </wp:inline>
+        </w:drawing>
+      </w:r>
+    </w:p>
+    <w:p>
+      <w:pPr>
+        <w:spacing w:before="40" w:after="200"/>
+        <w:jc w:val="center"/>
+      </w:pPr>
+      <w:r>
+        <w:rPr>
+          <w:i/>
+          <w:color w:val="64748B"/>
+          <w:sz w:val="17"/>
+        </w:rPr>
+        <w:t>Figure: Aaji AI Conversational Assistant Delivering Live Authentic Recipe &amp; Order Support</w:t>
+      </w:r>
+    </w:p>
+    <w:p>
+      <w:pPr>
+        <w:pStyle w:val="Heading2"/>
+        <w:keepNext/>
+        <w:spacing w:before="240" w:after="80"/>
+      </w:pPr>
+      <w:r>
+        <w:rPr>
+          <w:rFonts w:ascii="Calibri" w:hAnsi="Calibri"/>
+          <w:color w:val="1E40AF"/>
+        </w:rPr>
+        <w:t>3.3 Regional Cultural Localization: Marathi (मराठी) Language Switcher</w:t>
+      </w:r>
+    </w:p>
+    <w:p>
+      <w:pPr>
+        <w:spacing w:line="276" w:lineRule="auto" w:after="80"/>
+      </w:pPr>
+      <w:r>
+        <w:rPr>
+          <w:b/>
+        </w:rPr>
+        <w:t xml:space="preserve">• Problem / Baseline Defect: </w:t>
+      </w:r>
+      <w:r>
+        <w:t>Being an authentic Maharashtrian heritage culinary brand since 1935, the lack of regional Marathi language support alienated regional homemakers, festive buyers, and senior consumers.</w:t>
+      </w:r>
+    </w:p>
+    <w:p>
+      <w:pPr>
+        <w:spacing w:line="276" w:lineRule="auto" w:after="80"/>
+      </w:pPr>
+      <w:r>
+        <w:rPr>
+          <w:b/>
+        </w:rPr>
+        <w:t xml:space="preserve">• Engineered Solution: </w:t>
+      </w:r>
+      <w:r>
+        <w:t>Implemented a dedicated language state engine (languageStore.js) with a prominent toggle (🌐 मराठी / EN) in the top announcement ribbon, navigation bar, and mobile drawer. Translates all navigation items, announcements, search placeholders, and currency units seamlessly.</w:t>
+      </w:r>
+    </w:p>
+    <w:p>
+      <w:pPr>
+        <w:spacing w:after="120"/>
+      </w:pPr>
+      <w:r>
+        <w:rPr>
+          <w:b/>
+        </w:rPr>
+        <w:t xml:space="preserve">• Live Verification URL: </w:t>
+      </w:r>
+      <w:r>
+        <w:rPr>
+          <w:color w:val="2563EB"/>
+          <w:u w:val="single"/>
+        </w:rPr>
+        <w:t>https://naikfoods-platform.vercel.app</w:t>
+      </w:r>
+    </w:p>
+    <w:p>
+      <w:pPr>
+        <w:spacing w:before="160" w:after="40"/>
+        <w:jc w:val="center"/>
+      </w:pPr>
+      <w:r>
+        <w:drawing>
+          <wp:inline xmlns:a="http://schemas.openxmlformats.org/drawingml/2006/main" xmlns:pic="http://schemas.openxmlformats.org/drawingml/2006/picture">
+            <wp:extent cx="5303520" cy="2519172"/>
+            <wp:docPr id="3" name="Picture 3"/>
+            <wp:cNvGraphicFramePr>
+              <a:graphicFrameLocks noChangeAspect="1"/>
+            </wp:cNvGraphicFramePr>
+            <a:graphic>
+              <a:graphicData uri="http://schemas.openxmlformats.org/drawingml/2006/picture">
+                <pic:pic>
+                  <pic:nvPicPr>
+                    <pic:cNvPr id="0" name="fresh_07_marathi_localization_1788807117599.png"/>
+                    <pic:cNvPicPr/>
+                  </pic:nvPicPr>
+                  <pic:blipFill>
+                    <a:blip r:embed="rId11"/>
+                    <a:stretch>
+                      <a:fillRect/>
+                    </a:stretch>
+                  </pic:blipFill>
+                  <pic:spPr>
+                    <a:xfrm>
+                      <a:off x="0" y="0"/>
+                      <a:ext cx="5303520" cy="2519172"/>
+                    </a:xfrm>
+                    <a:prstGeom prst="rect"/>
+                  </pic:spPr>
+                </pic:pic>
+              </a:graphicData>
+            </a:graphic>
+          </wp:inline>
+        </w:drawing>
+      </w:r>
+    </w:p>
+    <w:p>
+      <w:pPr>
+        <w:spacing w:before="40" w:after="200"/>
+        <w:jc w:val="center"/>
+      </w:pPr>
+      <w:r>
+        <w:rPr>
+          <w:i/>
+          <w:color w:val="64748B"/>
+          <w:sz w:val="17"/>
+        </w:rPr>
+        <w:t>Figure: Full Marathi (मराठी) Regional Linguistic Localization Across Header &amp; Navigation</w:t>
+      </w:r>
+    </w:p>
+    <w:p>
+      <w:pPr>
+        <w:pStyle w:val="Heading2"/>
+        <w:keepNext/>
+        <w:spacing w:before="240" w:after="80"/>
+      </w:pPr>
+      <w:r>
+        <w:rPr>
+          <w:rFonts w:ascii="Calibri" w:hAnsi="Calibri"/>
+          <w:color w:val="1E40AF"/>
+        </w:rPr>
+        <w:t>3.4 Multi-Method Authentication &amp; Frictionless Guest Checkout Gate</w:t>
       </w:r>
     </w:p>
     <w:p>
@@ -1188,7 +1548,7 @@
         <w:drawing>
           <wp:inline xmlns:a="http://schemas.openxmlformats.org/drawingml/2006/main" xmlns:pic="http://schemas.openxmlformats.org/drawingml/2006/picture">
             <wp:extent cx="5303520" cy="2519172"/>
-            <wp:docPr id="2" name="Picture 2"/>
+            <wp:docPr id="4" name="Picture 4"/>
             <wp:cNvGraphicFramePr>
               <a:graphicFrameLocks noChangeAspect="1"/>
             </wp:cNvGraphicFramePr>
@@ -1200,7 +1560,7 @@
                     <pic:cNvPicPr/>
                   </pic:nvPicPr>
                   <pic:blipFill>
-                    <a:blip r:embed="rId10"/>
+                    <a:blip r:embed="rId12"/>
                     <a:stretch>
                       <a:fillRect/>
                     </a:stretch>
@@ -1244,7 +1604,7 @@
           <w:rFonts w:ascii="Calibri" w:hAnsi="Calibri"/>
           <w:color w:val="1E40AF"/>
         </w:rPr>
-        <w:t>3.3 Cart Cross-Selling &amp; Contextual Product Recommendations</w:t>
+        <w:t>3.5 Cart Cross-Selling, Dynamic Recommendations &amp; Swad Coins Slider</w:t>
       </w:r>
     </w:p>
     <w:p>
@@ -1258,7 +1618,7 @@
         <w:t xml:space="preserve">• Problem / Baseline Defect: </w:t>
       </w:r>
       <w:r>
-        <w:t>Original cart shows only selected items with zero recommendations, missing significant revenue expansion opportunities.</w:t>
+        <w:t>Original cart showed only added items without complementary product cross-sells or dynamic reward incentives.</w:t>
       </w:r>
     </w:p>
     <w:p>
@@ -1272,7 +1632,7 @@
         <w:t xml:space="preserve">• Engineered Solution: </w:t>
       </w:r>
       <w:r>
-        <w:t>Built a dynamic 'You Might Also Like' recommendation section inside Cart.jsx that suggests high-affinity companion products (such as Goda Masala, Bakarwadi, and Mango Pickles) with 1-click 'Add to Cart' buttons, instant subtotal recalculation, and dynamic ₹499 Free Shipping progress updates.</w:t>
+        <w:t>Built a dynamic recommendation engine inside Cart.jsx that suggests high-affinity companion products (such as Goda Masala, Bakarwadi, and Mango Pickles) with 1-click 'Add to Cart' buttons, instant subtotal recalculation, a dynamic ₹499 Free Shipping progress meter, and a Swad Coins cashback redemption slider.</w:t>
       </w:r>
     </w:p>
     <w:p>
@@ -1302,234 +1662,6 @@
         <w:drawing>
           <wp:inline xmlns:a="http://schemas.openxmlformats.org/drawingml/2006/main" xmlns:pic="http://schemas.openxmlformats.org/drawingml/2006/picture">
             <wp:extent cx="5303520" cy="2519172"/>
-            <wp:docPr id="3" name="Picture 3"/>
-            <wp:cNvGraphicFramePr>
-              <a:graphicFrameLocks noChangeAspect="1"/>
-            </wp:cNvGraphicFramePr>
-            <a:graphic>
-              <a:graphicData uri="http://schemas.openxmlformats.org/drawingml/2006/picture">
-                <pic:pic>
-                  <pic:nvPicPr>
-                    <pic:cNvPr id="0" name="cart_promo_applied_1788795919687.png"/>
-                    <pic:cNvPicPr/>
-                  </pic:nvPicPr>
-                  <pic:blipFill>
-                    <a:blip r:embed="rId11"/>
-                    <a:stretch>
-                      <a:fillRect/>
-                    </a:stretch>
-                  </pic:blipFill>
-                  <pic:spPr>
-                    <a:xfrm>
-                      <a:off x="0" y="0"/>
-                      <a:ext cx="5303520" cy="2519172"/>
-                    </a:xfrm>
-                    <a:prstGeom prst="rect"/>
-                  </pic:spPr>
-                </pic:pic>
-              </a:graphicData>
-            </a:graphic>
-          </wp:inline>
-        </w:drawing>
-      </w:r>
-    </w:p>
-    <w:p>
-      <w:pPr>
-        <w:spacing w:before="40" w:after="200"/>
-        <w:jc w:val="center"/>
-      </w:pPr>
-      <w:r>
-        <w:rPr>
-          <w:i/>
-          <w:color w:val="64748B"/>
-          <w:sz w:val="17"/>
-        </w:rPr>
-        <w:t>Figure: Cart Recommendation Section with 1-Click Add &amp; Free Shipping Progress Bar</w:t>
-      </w:r>
-    </w:p>
-    <w:p>
-      <w:pPr>
-        <w:pStyle w:val="Heading2"/>
-        <w:keepNext/>
-        <w:spacing w:before="240" w:after="80"/>
-      </w:pPr>
-      <w:r>
-        <w:rPr>
-          <w:rFonts w:ascii="Calibri" w:hAnsi="Calibri"/>
-          <w:color w:val="1E40AF"/>
-        </w:rPr>
-        <w:t>3.4 Interactive Wishlist / Favorites System &amp; Responsive Header Layout</w:t>
-      </w:r>
-    </w:p>
-    <w:p>
-      <w:pPr>
-        <w:spacing w:line="276" w:lineRule="auto" w:after="80"/>
-      </w:pPr>
-      <w:r>
-        <w:rPr>
-          <w:b/>
-        </w:rPr>
-        <w:t xml:space="preserve">• Problem / Baseline Defect: </w:t>
-      </w:r>
-      <w:r>
-        <w:t>Product cards had static non-functional heart icons with no way to save favorites, and long navigation text in regional languages caused header action icons to overflow.</w:t>
-      </w:r>
-    </w:p>
-    <w:p>
-      <w:pPr>
-        <w:spacing w:line="276" w:lineRule="auto" w:after="80"/>
-      </w:pPr>
-      <w:r>
-        <w:rPr>
-          <w:b/>
-        </w:rPr>
-        <w:t xml:space="preserve">• Engineered Solution: </w:t>
-      </w:r>
-      <w:r>
-        <w:t>Connected all product cards across Shop.jsx, Home.jsx, and ProductDetails.jsx to a persistent useWishlistStore with animated heart pop feedback and toast notifications. Re-engineered the Header.jsx responsive layout so Wishlist and Cart badges are always visible and updated in real-time across all screen sizes.</w:t>
-      </w:r>
-    </w:p>
-    <w:p>
-      <w:pPr>
-        <w:spacing w:after="120"/>
-      </w:pPr>
-      <w:r>
-        <w:rPr>
-          <w:b/>
-        </w:rPr>
-        <w:t xml:space="preserve">• Live Verification URL: </w:t>
-      </w:r>
-      <w:r>
-        <w:rPr>
-          <w:color w:val="2563EB"/>
-          <w:u w:val="single"/>
-        </w:rPr>
-        <w:t>https://naikfoods-platform.vercel.app/in/wishlist</w:t>
-      </w:r>
-    </w:p>
-    <w:p>
-      <w:pPr>
-        <w:spacing w:before="160" w:after="40"/>
-        <w:jc w:val="center"/>
-      </w:pPr>
-      <w:r>
-        <w:drawing>
-          <wp:inline xmlns:a="http://schemas.openxmlformats.org/drawingml/2006/main" xmlns:pic="http://schemas.openxmlformats.org/drawingml/2006/picture">
-            <wp:extent cx="5303520" cy="2519172"/>
-            <wp:docPr id="4" name="Picture 4"/>
-            <wp:cNvGraphicFramePr>
-              <a:graphicFrameLocks noChangeAspect="1"/>
-            </wp:cNvGraphicFramePr>
-            <a:graphic>
-              <a:graphicData uri="http://schemas.openxmlformats.org/drawingml/2006/picture">
-                <pic:pic>
-                  <pic:nvPicPr>
-                    <pic:cNvPr id="0" name="03_cart_page_1788797959802.png"/>
-                    <pic:cNvPicPr/>
-                  </pic:nvPicPr>
-                  <pic:blipFill>
-                    <a:blip r:embed="rId12"/>
-                    <a:stretch>
-                      <a:fillRect/>
-                    </a:stretch>
-                  </pic:blipFill>
-                  <pic:spPr>
-                    <a:xfrm>
-                      <a:off x="0" y="0"/>
-                      <a:ext cx="5303520" cy="2519172"/>
-                    </a:xfrm>
-                    <a:prstGeom prst="rect"/>
-                  </pic:spPr>
-                </pic:pic>
-              </a:graphicData>
-            </a:graphic>
-          </wp:inline>
-        </w:drawing>
-      </w:r>
-    </w:p>
-    <w:p>
-      <w:pPr>
-        <w:spacing w:before="40" w:after="200"/>
-        <w:jc w:val="center"/>
-      </w:pPr>
-      <w:r>
-        <w:rPr>
-          <w:i/>
-          <w:color w:val="64748B"/>
-          <w:sz w:val="17"/>
-        </w:rPr>
-        <w:t>Figure: Interactive Wishlist &amp; Shopping Cart with Dynamic Badge Counters</w:t>
-      </w:r>
-    </w:p>
-    <w:p>
-      <w:pPr>
-        <w:pStyle w:val="Heading2"/>
-        <w:keepNext/>
-        <w:spacing w:before="240" w:after="80"/>
-      </w:pPr>
-      <w:r>
-        <w:rPr>
-          <w:rFonts w:ascii="Calibri" w:hAnsi="Calibri"/>
-          <w:color w:val="1E40AF"/>
-        </w:rPr>
-        <w:t>3.5 Interactive Draggable &amp; Hoverable WhatsApp Support FAB</w:t>
-      </w:r>
-    </w:p>
-    <w:p>
-      <w:pPr>
-        <w:spacing w:line="276" w:lineRule="auto" w:after="80"/>
-      </w:pPr>
-      <w:r>
-        <w:rPr>
-          <w:b/>
-        </w:rPr>
-        <w:t xml:space="preserve">• Problem / Baseline Defect: </w:t>
-      </w:r>
-      <w:r>
-        <w:t>Fixed floating support widgets on mobile viewports obstruct primary checkout buttons, coupon inputs, and legal footer links, causing frustrating click-interception issues.</w:t>
-      </w:r>
-    </w:p>
-    <w:p>
-      <w:pPr>
-        <w:spacing w:line="276" w:lineRule="auto" w:after="80"/>
-      </w:pPr>
-      <w:r>
-        <w:rPr>
-          <w:b/>
-        </w:rPr>
-        <w:t xml:space="preserve">• Engineered Solution: </w:t>
-      </w:r>
-      <w:r>
-        <w:t>Developed a custom Draggable &amp; Hoverable WhatsApp FAB (WhatsAppFAB.jsx) supporting free touch/pointer dragging along screen edges, glowing green radar animations, expanding tooltips, and a unified companion Scroll-to-Top button.</w:t>
-      </w:r>
-    </w:p>
-    <w:p>
-      <w:pPr>
-        <w:spacing w:after="120"/>
-      </w:pPr>
-      <w:r>
-        <w:rPr>
-          <w:b/>
-        </w:rPr>
-        <w:t xml:space="preserve">• Live Verification URL: </w:t>
-      </w:r>
-      <w:r>
-        <w:rPr>
-          <w:color w:val="2563EB"/>
-          <w:u w:val="single"/>
-        </w:rPr>
-        <w:t>https://naikfoods-platform.vercel.app</w:t>
-      </w:r>
-    </w:p>
-    <w:p>
-      <w:pPr>
-        <w:spacing w:before="160" w:after="40"/>
-        <w:jc w:val="center"/>
-      </w:pPr>
-      <w:r>
-        <w:drawing>
-          <wp:inline xmlns:a="http://schemas.openxmlformats.org/drawingml/2006/main" xmlns:pic="http://schemas.openxmlformats.org/drawingml/2006/picture">
-            <wp:extent cx="5303520" cy="2519172"/>
             <wp:docPr id="5" name="Picture 5"/>
             <wp:cNvGraphicFramePr>
               <a:graphicFrameLocks noChangeAspect="1"/>
@@ -1538,7 +1670,7 @@
               <a:graphicData uri="http://schemas.openxmlformats.org/drawingml/2006/picture">
                 <pic:pic>
                   <pic:nvPicPr>
-                    <pic:cNvPr id="0" name="aaji_ai_verified_1788796086778.png"/>
+                    <pic:cNvPr id="0" name="fresh_05_cart_recommendations_and_coins_1788807027394.png"/>
                     <pic:cNvPicPr/>
                   </pic:nvPicPr>
                   <pic:blipFill>
@@ -1572,7 +1704,7 @@
           <w:color w:val="64748B"/>
           <w:sz w:val="17"/>
         </w:rPr>
-        <w:t>Figure: Draggable Support FAB with Integrated 24/7 AI Kitchen Concierge ('Aaji AI')</w:t>
+        <w:t>Figure: Cart Recommendation Section with 1-Click Add, Free Delivery Meter &amp; Coins Slider</w:t>
       </w:r>
     </w:p>
     <w:p>
@@ -1586,7 +1718,463 @@
           <w:rFonts w:ascii="Calibri" w:hAnsi="Calibri"/>
           <w:color w:val="1E40AF"/>
         </w:rPr>
-        <w:t>3.6 Smart Map &amp; GPS Pinpoint Address Selector</w:t>
+        <w:t>3.6 Interactive Wishlist / Favorites Engine &amp; Responsive Header Badges</w:t>
+      </w:r>
+    </w:p>
+    <w:p>
+      <w:pPr>
+        <w:spacing w:line="276" w:lineRule="auto" w:after="80"/>
+      </w:pPr>
+      <w:r>
+        <w:rPr>
+          <w:b/>
+        </w:rPr>
+        <w:t xml:space="preserve">• Problem / Baseline Defect: </w:t>
+      </w:r>
+      <w:r>
+        <w:t>Product cards had static non-functional heart icons with no way to save favorites, and long navigation text caused header action icons to overflow.</w:t>
+      </w:r>
+    </w:p>
+    <w:p>
+      <w:pPr>
+        <w:spacing w:line="276" w:lineRule="auto" w:after="80"/>
+      </w:pPr>
+      <w:r>
+        <w:rPr>
+          <w:b/>
+        </w:rPr>
+        <w:t xml:space="preserve">• Engineered Solution: </w:t>
+      </w:r>
+      <w:r>
+        <w:t>Connected all product cards across Shop.jsx, Home.jsx, and ProductDetails.jsx to a persistent useWishlistStore with animated heart pop feedback, toast notifications, and dedicated Wishlist page (/in/wishlist). Re-engineered Header.jsx so Wishlist and Cart badges remain perfectly visible and responsive.</w:t>
+      </w:r>
+    </w:p>
+    <w:p>
+      <w:pPr>
+        <w:spacing w:after="120"/>
+      </w:pPr>
+      <w:r>
+        <w:rPr>
+          <w:b/>
+        </w:rPr>
+        <w:t xml:space="preserve">• Live Verification URL: </w:t>
+      </w:r>
+      <w:r>
+        <w:rPr>
+          <w:color w:val="2563EB"/>
+          <w:u w:val="single"/>
+        </w:rPr>
+        <w:t>https://naikfoods-platform.vercel.app/in/wishlist</w:t>
+      </w:r>
+    </w:p>
+    <w:p>
+      <w:pPr>
+        <w:spacing w:before="160" w:after="40"/>
+        <w:jc w:val="center"/>
+      </w:pPr>
+      <w:r>
+        <w:drawing>
+          <wp:inline xmlns:a="http://schemas.openxmlformats.org/drawingml/2006/main" xmlns:pic="http://schemas.openxmlformats.org/drawingml/2006/picture">
+            <wp:extent cx="5303520" cy="2519172"/>
+            <wp:docPr id="6" name="Picture 6"/>
+            <wp:cNvGraphicFramePr>
+              <a:graphicFrameLocks noChangeAspect="1"/>
+            </wp:cNvGraphicFramePr>
+            <a:graphic>
+              <a:graphicData uri="http://schemas.openxmlformats.org/drawingml/2006/picture">
+                <pic:pic>
+                  <pic:nvPicPr>
+                    <pic:cNvPr id="0" name="fresh_01_homepage_header_1788806875570.png"/>
+                    <pic:cNvPicPr/>
+                  </pic:nvPicPr>
+                  <pic:blipFill>
+                    <a:blip r:embed="rId14"/>
+                    <a:stretch>
+                      <a:fillRect/>
+                    </a:stretch>
+                  </pic:blipFill>
+                  <pic:spPr>
+                    <a:xfrm>
+                      <a:off x="0" y="0"/>
+                      <a:ext cx="5303520" cy="2519172"/>
+                    </a:xfrm>
+                    <a:prstGeom prst="rect"/>
+                  </pic:spPr>
+                </pic:pic>
+              </a:graphicData>
+            </a:graphic>
+          </wp:inline>
+        </w:drawing>
+      </w:r>
+    </w:p>
+    <w:p>
+      <w:pPr>
+        <w:spacing w:before="40" w:after="200"/>
+        <w:jc w:val="center"/>
+      </w:pPr>
+      <w:r>
+        <w:rPr>
+          <w:i/>
+          <w:color w:val="64748B"/>
+          <w:sz w:val="17"/>
+        </w:rPr>
+        <w:t>Figure: Responsive Header with Real-Time Wishlist &amp; Cart Counters and Marathi Toggle</w:t>
+      </w:r>
+    </w:p>
+    <w:p>
+      <w:pPr>
+        <w:pStyle w:val="Heading2"/>
+        <w:keepNext/>
+        <w:spacing w:before="240" w:after="80"/>
+      </w:pPr>
+      <w:r>
+        <w:rPr>
+          <w:rFonts w:ascii="Calibri" w:hAnsi="Calibri"/>
+          <w:color w:val="1E40AF"/>
+        </w:rPr>
+        <w:t>3.7 Multi-Payment Gateway Matrix &amp; Conditional Cash on Delivery (COD) Risk Engine</w:t>
+      </w:r>
+    </w:p>
+    <w:p>
+      <w:pPr>
+        <w:spacing w:line="276" w:lineRule="auto" w:after="80"/>
+      </w:pPr>
+      <w:r>
+        <w:rPr>
+          <w:b/>
+        </w:rPr>
+        <w:t xml:space="preserve">• Problem / Baseline Defect: </w:t>
+      </w:r>
+      <w:r>
+        <w:t>Baseline platform had rigid payment flows prone to gateway timeouts and lacked guardrails against high-ticket Cash on Delivery fraud and Return-to-Origin (RTO) courier losses.</w:t>
+      </w:r>
+    </w:p>
+    <w:p>
+      <w:pPr>
+        <w:spacing w:line="276" w:lineRule="auto" w:after="80"/>
+      </w:pPr>
+      <w:r>
+        <w:rPr>
+          <w:b/>
+        </w:rPr>
+        <w:t xml:space="preserve">• Engineered Solution: </w:t>
+      </w:r>
+      <w:r>
+        <w:t>Engineered a comprehensive payment state machine in Checkout.jsx featuring: (1) Instant UPI (GPay, PhonePe, Paytm, QR) with zero surcharge, (2) Credit/Debit Cards &amp; Net Banking for all major Indian banks, (3) Swad Coins direct cashback deduction slider (1 Coin = ₹1), and (4) Conditional Cash on Delivery (COD) rules restricting COD to orders between ₹299 and ₹1,500 (+₹40 handling fee) with automated real-time alerts and full order confirmation receipt generation.</w:t>
+      </w:r>
+    </w:p>
+    <w:p>
+      <w:pPr>
+        <w:spacing w:after="120"/>
+      </w:pPr>
+      <w:r>
+        <w:rPr>
+          <w:b/>
+        </w:rPr>
+        <w:t xml:space="preserve">• Live Verification URL: </w:t>
+      </w:r>
+      <w:r>
+        <w:rPr>
+          <w:color w:val="2563EB"/>
+          <w:u w:val="single"/>
+        </w:rPr>
+        <w:t>https://naikfoods-platform.vercel.app/in/checkout</w:t>
+      </w:r>
+    </w:p>
+    <w:p>
+      <w:pPr>
+        <w:spacing w:before="160" w:after="40"/>
+        <w:jc w:val="center"/>
+      </w:pPr>
+      <w:r>
+        <w:drawing>
+          <wp:inline xmlns:a="http://schemas.openxmlformats.org/drawingml/2006/main" xmlns:pic="http://schemas.openxmlformats.org/drawingml/2006/picture">
+            <wp:extent cx="5303520" cy="2519172"/>
+            <wp:docPr id="7" name="Picture 7"/>
+            <wp:cNvGraphicFramePr>
+              <a:graphicFrameLocks noChangeAspect="1"/>
+            </wp:cNvGraphicFramePr>
+            <a:graphic>
+              <a:graphicData uri="http://schemas.openxmlformats.org/drawingml/2006/picture">
+                <pic:pic>
+                  <pic:nvPicPr>
+                    <pic:cNvPr id="0" name="fresh_06_checkout_gps_and_payments_1788807092870.png"/>
+                    <pic:cNvPicPr/>
+                  </pic:nvPicPr>
+                  <pic:blipFill>
+                    <a:blip r:embed="rId15"/>
+                    <a:stretch>
+                      <a:fillRect/>
+                    </a:stretch>
+                  </pic:blipFill>
+                  <pic:spPr>
+                    <a:xfrm>
+                      <a:off x="0" y="0"/>
+                      <a:ext cx="5303520" cy="2519172"/>
+                    </a:xfrm>
+                    <a:prstGeom prst="rect"/>
+                  </pic:spPr>
+                </pic:pic>
+              </a:graphicData>
+            </a:graphic>
+          </wp:inline>
+        </w:drawing>
+      </w:r>
+    </w:p>
+    <w:p>
+      <w:pPr>
+        <w:spacing w:before="40" w:after="200"/>
+        <w:jc w:val="center"/>
+      </w:pPr>
+      <w:r>
+        <w:rPr>
+          <w:i/>
+          <w:color w:val="64748B"/>
+          <w:sz w:val="17"/>
+        </w:rPr>
+        <w:t>Figure: Multi-Payment Selection Matrix with Conditional COD Rules &amp; Swad Coins Redemption</w:t>
+      </w:r>
+    </w:p>
+    <w:p>
+      <w:pPr>
+        <w:pStyle w:val="Heading2"/>
+        <w:keepNext/>
+        <w:spacing w:before="240" w:after="80"/>
+      </w:pPr>
+      <w:r>
+        <w:rPr>
+          <w:rFonts w:ascii="Calibri" w:hAnsi="Calibri"/>
+          <w:color w:val="1E40AF"/>
+        </w:rPr>
+        <w:t>3.8 Festive Hamper Builder (Custom Gift Box Configurator with 15% Off)</w:t>
+      </w:r>
+    </w:p>
+    <w:p>
+      <w:pPr>
+        <w:spacing w:line="276" w:lineRule="auto" w:after="80"/>
+      </w:pPr>
+      <w:r>
+        <w:rPr>
+          <w:b/>
+        </w:rPr>
+        <w:t xml:space="preserve">• Problem / Baseline Defect: </w:t>
+      </w:r>
+      <w:r>
+        <w:t>Traditional festive shoppers want customized gift packaging rather than buying individual pre-packaged units.</w:t>
+      </w:r>
+    </w:p>
+    <w:p>
+      <w:pPr>
+        <w:spacing w:line="276" w:lineRule="auto" w:after="80"/>
+      </w:pPr>
+      <w:r>
+        <w:rPr>
+          <w:b/>
+        </w:rPr>
+        <w:t xml:space="preserve">• Engineered Solution: </w:t>
+      </w:r>
+      <w:r>
+        <w:t>Engineered an interactive 3-step bundle customizer: Step 1 (Select 4, 6, or 8 item box size), Step 2 (Pick authentic masalas, sweets, and savories with a real-time slot counter), Step 3 (Personalized greeting card message with an automated 15% bundle discount).</w:t>
+      </w:r>
+    </w:p>
+    <w:p>
+      <w:pPr>
+        <w:spacing w:after="120"/>
+      </w:pPr>
+      <w:r>
+        <w:rPr>
+          <w:b/>
+        </w:rPr>
+        <w:t xml:space="preserve">• Live Verification URL: </w:t>
+      </w:r>
+      <w:r>
+        <w:rPr>
+          <w:color w:val="2563EB"/>
+          <w:u w:val="single"/>
+        </w:rPr>
+        <w:t>https://naikfoods-platform.vercel.app/in/box-builder</w:t>
+      </w:r>
+    </w:p>
+    <w:p>
+      <w:pPr>
+        <w:spacing w:before="160" w:after="40"/>
+        <w:jc w:val="center"/>
+      </w:pPr>
+      <w:r>
+        <w:drawing>
+          <wp:inline xmlns:a="http://schemas.openxmlformats.org/drawingml/2006/main" xmlns:pic="http://schemas.openxmlformats.org/drawingml/2006/picture">
+            <wp:extent cx="5303520" cy="2519172"/>
+            <wp:docPr id="8" name="Picture 8"/>
+            <wp:cNvGraphicFramePr>
+              <a:graphicFrameLocks noChangeAspect="1"/>
+            </wp:cNvGraphicFramePr>
+            <a:graphic>
+              <a:graphicData uri="http://schemas.openxmlformats.org/drawingml/2006/picture">
+                <pic:pic>
+                  <pic:nvPicPr>
+                    <pic:cNvPr id="0" name="fresh_04_festive_hamper_builder_1788806990064.png"/>
+                    <pic:cNvPicPr/>
+                  </pic:nvPicPr>
+                  <pic:blipFill>
+                    <a:blip r:embed="rId16"/>
+                    <a:stretch>
+                      <a:fillRect/>
+                    </a:stretch>
+                  </pic:blipFill>
+                  <pic:spPr>
+                    <a:xfrm>
+                      <a:off x="0" y="0"/>
+                      <a:ext cx="5303520" cy="2519172"/>
+                    </a:xfrm>
+                    <a:prstGeom prst="rect"/>
+                  </pic:spPr>
+                </pic:pic>
+              </a:graphicData>
+            </a:graphic>
+          </wp:inline>
+        </w:drawing>
+      </w:r>
+    </w:p>
+    <w:p>
+      <w:pPr>
+        <w:spacing w:before="40" w:after="200"/>
+        <w:jc w:val="center"/>
+      </w:pPr>
+      <w:r>
+        <w:rPr>
+          <w:i/>
+          <w:color w:val="64748B"/>
+          <w:sz w:val="17"/>
+        </w:rPr>
+        <w:t>Figure: Festive Hamper Configurator with Real-Time Slot Tracker and 15% Dynamic Discount</w:t>
+      </w:r>
+    </w:p>
+    <w:p>
+      <w:pPr>
+        <w:pStyle w:val="Heading2"/>
+        <w:keepNext/>
+        <w:spacing w:before="240" w:after="80"/>
+      </w:pPr>
+      <w:r>
+        <w:rPr>
+          <w:rFonts w:ascii="Calibri" w:hAnsi="Calibri"/>
+          <w:color w:val="1E40AF"/>
+        </w:rPr>
+        <w:t>3.9 Dynamic Starlit Sky Night Theme with High-Contrast Text Protection</w:t>
+      </w:r>
+    </w:p>
+    <w:p>
+      <w:pPr>
+        <w:spacing w:line="276" w:lineRule="auto" w:after="80"/>
+      </w:pPr>
+      <w:r>
+        <w:rPr>
+          <w:b/>
+        </w:rPr>
+        <w:t xml:space="preserve">• Problem / Baseline Defect: </w:t>
+      </w:r>
+      <w:r>
+        <w:t>Generic dark themes often result in low contrast, washed-out text, or invisible white text on light containers when theme switching occurs.</w:t>
+      </w:r>
+    </w:p>
+    <w:p>
+      <w:pPr>
+        <w:spacing w:line="276" w:lineRule="auto" w:after="80"/>
+      </w:pPr>
+      <w:r>
+        <w:rPr>
+          <w:b/>
+        </w:rPr>
+        <w:t xml:space="preserve">• Engineered Solution: </w:t>
+      </w:r>
+      <w:r>
+        <w:t>Engineered a celestial 'Starlit Sky' dark mode with high-contrast WCAG AAA text rules, vibrant green action buttons, illuminated card borders, glowing shadows, and guaranteed zero text wash across all headers, cards, inputs, and modals.</w:t>
+      </w:r>
+    </w:p>
+    <w:p>
+      <w:pPr>
+        <w:spacing w:after="120"/>
+      </w:pPr>
+      <w:r>
+        <w:rPr>
+          <w:b/>
+        </w:rPr>
+        <w:t xml:space="preserve">• Live Verification URL: </w:t>
+      </w:r>
+      <w:r>
+        <w:rPr>
+          <w:color w:val="2563EB"/>
+          <w:u w:val="single"/>
+        </w:rPr>
+        <w:t>https://naikfoods-platform.vercel.app</w:t>
+      </w:r>
+    </w:p>
+    <w:p>
+      <w:pPr>
+        <w:spacing w:before="160" w:after="40"/>
+        <w:jc w:val="center"/>
+      </w:pPr>
+      <w:r>
+        <w:drawing>
+          <wp:inline xmlns:a="http://schemas.openxmlformats.org/drawingml/2006/main" xmlns:pic="http://schemas.openxmlformats.org/drawingml/2006/picture">
+            <wp:extent cx="5303520" cy="2519172"/>
+            <wp:docPr id="9" name="Picture 9"/>
+            <wp:cNvGraphicFramePr>
+              <a:graphicFrameLocks noChangeAspect="1"/>
+            </wp:cNvGraphicFramePr>
+            <a:graphic>
+              <a:graphicData uri="http://schemas.openxmlformats.org/drawingml/2006/picture">
+                <pic:pic>
+                  <pic:nvPicPr>
+                    <pic:cNvPr id="0" name="fresh_08_starlit_sky_night_mode_1788807144501.png"/>
+                    <pic:cNvPicPr/>
+                  </pic:nvPicPr>
+                  <pic:blipFill>
+                    <a:blip r:embed="rId17"/>
+                    <a:stretch>
+                      <a:fillRect/>
+                    </a:stretch>
+                  </pic:blipFill>
+                  <pic:spPr>
+                    <a:xfrm>
+                      <a:off x="0" y="0"/>
+                      <a:ext cx="5303520" cy="2519172"/>
+                    </a:xfrm>
+                    <a:prstGeom prst="rect"/>
+                  </pic:spPr>
+                </pic:pic>
+              </a:graphicData>
+            </a:graphic>
+          </wp:inline>
+        </w:drawing>
+      </w:r>
+    </w:p>
+    <w:p>
+      <w:pPr>
+        <w:spacing w:before="40" w:after="200"/>
+        <w:jc w:val="center"/>
+      </w:pPr>
+      <w:r>
+        <w:rPr>
+          <w:i/>
+          <w:color w:val="64748B"/>
+          <w:sz w:val="17"/>
+        </w:rPr>
+        <w:t>Figure: High-Contrast Starlit Sky Night Theme with Crystal-Clear Headings &amp; Dynamic Badges</w:t>
+      </w:r>
+    </w:p>
+    <w:p>
+      <w:pPr>
+        <w:pStyle w:val="Heading2"/>
+        <w:keepNext/>
+        <w:spacing w:before="240" w:after="80"/>
+      </w:pPr>
+      <w:r>
+        <w:rPr>
+          <w:rFonts w:ascii="Calibri" w:hAnsi="Calibri"/>
+          <w:color w:val="1E40AF"/>
+        </w:rPr>
+        <w:t>3.10 Smart Map &amp; GPS Pinpoint Address Selector with Leaflet &amp; OSM</w:t>
       </w:r>
     </w:p>
     <w:p>
@@ -1644,7 +2232,7 @@
         <w:drawing>
           <wp:inline xmlns:a="http://schemas.openxmlformats.org/drawingml/2006/main" xmlns:pic="http://schemas.openxmlformats.org/drawingml/2006/picture">
             <wp:extent cx="5303520" cy="2519172"/>
-            <wp:docPr id="6" name="Picture 6"/>
+            <wp:docPr id="10" name="Picture 10"/>
             <wp:cNvGraphicFramePr>
               <a:graphicFrameLocks noChangeAspect="1"/>
             </wp:cNvGraphicFramePr>
@@ -1652,121 +2240,7 @@
               <a:graphicData uri="http://schemas.openxmlformats.org/drawingml/2006/picture">
                 <pic:pic>
                   <pic:nvPicPr>
-                    <pic:cNvPr id="0" name="checkout_page_1788796889936.png"/>
-                    <pic:cNvPicPr/>
-                  </pic:nvPicPr>
-                  <pic:blipFill>
-                    <a:blip r:embed="rId14"/>
-                    <a:stretch>
-                      <a:fillRect/>
-                    </a:stretch>
-                  </pic:blipFill>
-                  <pic:spPr>
-                    <a:xfrm>
-                      <a:off x="0" y="0"/>
-                      <a:ext cx="5303520" cy="2519172"/>
-                    </a:xfrm>
-                    <a:prstGeom prst="rect"/>
-                  </pic:spPr>
-                </pic:pic>
-              </a:graphicData>
-            </a:graphic>
-          </wp:inline>
-        </w:drawing>
-      </w:r>
-    </w:p>
-    <w:p>
-      <w:pPr>
-        <w:spacing w:before="40" w:after="200"/>
-        <w:jc w:val="center"/>
-      </w:pPr>
-      <w:r>
-        <w:rPr>
-          <w:i/>
-          <w:color w:val="64748B"/>
-          <w:sz w:val="17"/>
-        </w:rPr>
-        <w:t>Figure: Interactive Geospatial Address Selector with Leaflet &amp; OpenStreetMap</w:t>
-      </w:r>
-    </w:p>
-    <w:p>
-      <w:pPr>
-        <w:pStyle w:val="Heading2"/>
-        <w:keepNext/>
-        <w:spacing w:before="240" w:after="80"/>
-      </w:pPr>
-      <w:r>
-        <w:rPr>
-          <w:rFonts w:ascii="Calibri" w:hAnsi="Calibri"/>
-          <w:color w:val="1E40AF"/>
-        </w:rPr>
-        <w:t>3.7 Festive Hamper Builder (Custom Gift Box Configurator with 15% Off)</w:t>
-      </w:r>
-    </w:p>
-    <w:p>
-      <w:pPr>
-        <w:spacing w:line="276" w:lineRule="auto" w:after="80"/>
-      </w:pPr>
-      <w:r>
-        <w:rPr>
-          <w:b/>
-        </w:rPr>
-        <w:t xml:space="preserve">• Problem / Baseline Defect: </w:t>
-      </w:r>
-      <w:r>
-        <w:t>Traditional festive shoppers want customized gift packaging rather than buying individual pre-packaged units.</w:t>
-      </w:r>
-    </w:p>
-    <w:p>
-      <w:pPr>
-        <w:spacing w:line="276" w:lineRule="auto" w:after="80"/>
-      </w:pPr>
-      <w:r>
-        <w:rPr>
-          <w:b/>
-        </w:rPr>
-        <w:t xml:space="preserve">• Engineered Solution: </w:t>
-      </w:r>
-      <w:r>
-        <w:t>Engineered an interactive 3-step bundle customizer: Step 1 (Select 4, 6, or 8 item box size), Step 2 (Pick authentic masalas, sweets, and savories with a real-time slot counter), Step 3 (Personalized greeting card message with an automated 15% bundle discount).</w:t>
-      </w:r>
-    </w:p>
-    <w:p>
-      <w:pPr>
-        <w:spacing w:after="120"/>
-      </w:pPr>
-      <w:r>
-        <w:rPr>
-          <w:b/>
-        </w:rPr>
-        <w:t xml:space="preserve">• Live Verification URL: </w:t>
-      </w:r>
-      <w:r>
-        <w:rPr>
-          <w:color w:val="2563EB"/>
-          <w:u w:val="single"/>
-        </w:rPr>
-        <w:t>https://naikfoods-platform.vercel.app/in/box-builder</w:t>
-      </w:r>
-    </w:p>
-    <w:p>
-      <w:pPr>
-        <w:spacing w:before="160" w:after="40"/>
-        <w:jc w:val="center"/>
-      </w:pPr>
-      <w:r>
-        <w:drawing>
-          <wp:inline xmlns:a="http://schemas.openxmlformats.org/drawingml/2006/main" xmlns:pic="http://schemas.openxmlformats.org/drawingml/2006/picture">
-            <wp:extent cx="5303520" cy="2519172"/>
-            <wp:docPr id="7" name="Picture 7"/>
-            <wp:cNvGraphicFramePr>
-              <a:graphicFrameLocks noChangeAspect="1"/>
-            </wp:cNvGraphicFramePr>
-            <a:graphic>
-              <a:graphicData uri="http://schemas.openxmlformats.org/drawingml/2006/picture">
-                <pic:pic>
-                  <pic:nvPicPr>
-                    <pic:cNvPr id="0" name="box_builder_step1_1788796582575.png"/>
+                    <pic:cNvPr id="0" name="fresh_06_checkout_gps_and_payments_1788807092870.png"/>
                     <pic:cNvPicPr/>
                   </pic:nvPicPr>
                   <pic:blipFill>
@@ -1800,349 +2274,7 @@
           <w:color w:val="64748B"/>
           <w:sz w:val="17"/>
         </w:rPr>
-        <w:t>Figure: Festive Hamper Configurator with Real-Time Slot Tracker and 15% Dynamic Discount</w:t>
-      </w:r>
-    </w:p>
-    <w:p>
-      <w:pPr>
-        <w:pStyle w:val="Heading2"/>
-        <w:keepNext/>
-        <w:spacing w:before="240" w:after="80"/>
-      </w:pPr>
-      <w:r>
-        <w:rPr>
-          <w:rFonts w:ascii="Calibri" w:hAnsi="Calibri"/>
-          <w:color w:val="1E40AF"/>
-        </w:rPr>
-        <w:t>3.8 Swad Coins Loyalty Rewards Engine &amp; Tier Progression</w:t>
-      </w:r>
-    </w:p>
-    <w:p>
-      <w:pPr>
-        <w:spacing w:line="276" w:lineRule="auto" w:after="80"/>
-      </w:pPr>
-      <w:r>
-        <w:rPr>
-          <w:b/>
-        </w:rPr>
-        <w:t xml:space="preserve">• Problem / Baseline Defect: </w:t>
-      </w:r>
-      <w:r>
-        <w:t>Lack of customer retention mechanisms results in low customer lifetime value (LTV).</w:t>
-      </w:r>
-    </w:p>
-    <w:p>
-      <w:pPr>
-        <w:spacing w:line="276" w:lineRule="auto" w:after="80"/>
-      </w:pPr>
-      <w:r>
-        <w:rPr>
-          <w:b/>
-        </w:rPr>
-        <w:t xml:space="preserve">• Engineered Solution: </w:t>
-      </w:r>
-      <w:r>
-        <w:t>Built a gamified loyalty rewards program granting 150 welcome bonus coins on registration, 5% cashback on all orders, tier progression (Silver ➔ Gold ➔ Platinum), and an instant 1-click redemption slider at cart &amp; checkout.</w:t>
-      </w:r>
-    </w:p>
-    <w:p>
-      <w:pPr>
-        <w:spacing w:after="120"/>
-      </w:pPr>
-      <w:r>
-        <w:rPr>
-          <w:b/>
-        </w:rPr>
-        <w:t xml:space="preserve">• Live Verification URL: </w:t>
-      </w:r>
-      <w:r>
-        <w:rPr>
-          <w:color w:val="2563EB"/>
-          <w:u w:val="single"/>
-        </w:rPr>
-        <w:t>https://naikfoods-platform.vercel.app</w:t>
-      </w:r>
-    </w:p>
-    <w:p>
-      <w:pPr>
-        <w:spacing w:before="160" w:after="40"/>
-        <w:jc w:val="center"/>
-      </w:pPr>
-      <w:r>
-        <w:drawing>
-          <wp:inline xmlns:a="http://schemas.openxmlformats.org/drawingml/2006/main" xmlns:pic="http://schemas.openxmlformats.org/drawingml/2006/picture">
-            <wp:extent cx="5303520" cy="2519172"/>
-            <wp:docPr id="8" name="Picture 8"/>
-            <wp:cNvGraphicFramePr>
-              <a:graphicFrameLocks noChangeAspect="1"/>
-            </wp:cNvGraphicFramePr>
-            <a:graphic>
-              <a:graphicData uri="http://schemas.openxmlformats.org/drawingml/2006/picture">
-                <pic:pic>
-                  <pic:nvPicPr>
-                    <pic:cNvPr id="0" name="coins_modal_opened_1788796313207.png"/>
-                    <pic:cNvPicPr/>
-                  </pic:nvPicPr>
-                  <pic:blipFill>
-                    <a:blip r:embed="rId16"/>
-                    <a:stretch>
-                      <a:fillRect/>
-                    </a:stretch>
-                  </pic:blipFill>
-                  <pic:spPr>
-                    <a:xfrm>
-                      <a:off x="0" y="0"/>
-                      <a:ext cx="5303520" cy="2519172"/>
-                    </a:xfrm>
-                    <a:prstGeom prst="rect"/>
-                  </pic:spPr>
-                </pic:pic>
-              </a:graphicData>
-            </a:graphic>
-          </wp:inline>
-        </w:drawing>
-      </w:r>
-    </w:p>
-    <w:p>
-      <w:pPr>
-        <w:spacing w:before="40" w:after="200"/>
-        <w:jc w:val="center"/>
-      </w:pPr>
-      <w:r>
-        <w:rPr>
-          <w:i/>
-          <w:color w:val="64748B"/>
-          <w:sz w:val="17"/>
-        </w:rPr>
-        <w:t>Figure: 3D Gold Embossed Swad Coins Modal with Balance and Tier Status</w:t>
-      </w:r>
-    </w:p>
-    <w:p>
-      <w:pPr>
-        <w:pStyle w:val="Heading2"/>
-        <w:keepNext/>
-        <w:spacing w:before="240" w:after="80"/>
-      </w:pPr>
-      <w:r>
-        <w:rPr>
-          <w:rFonts w:ascii="Calibri" w:hAnsi="Calibri"/>
-          <w:color w:val="1E40AF"/>
-        </w:rPr>
-        <w:t>3.9 UI/UX Elevation: Spice Meter, Dietary Badges &amp; Starlit Sky Theme</w:t>
-      </w:r>
-    </w:p>
-    <w:p>
-      <w:pPr>
-        <w:spacing w:line="276" w:lineRule="auto" w:after="80"/>
-      </w:pPr>
-      <w:r>
-        <w:rPr>
-          <w:b/>
-        </w:rPr>
-        <w:t xml:space="preserve">• Problem / Baseline Defect: </w:t>
-      </w:r>
-      <w:r>
-        <w:t>Generic e-commerce layouts fail to convey spice heat levels or dietary suitability (e.g. Upwas/Fasting, Jain, Gluten-Free).</w:t>
-      </w:r>
-    </w:p>
-    <w:p>
-      <w:pPr>
-        <w:spacing w:line="276" w:lineRule="auto" w:after="80"/>
-      </w:pPr>
-      <w:r>
-        <w:rPr>
-          <w:b/>
-        </w:rPr>
-        <w:t xml:space="preserve">• Engineered Solution: </w:t>
-      </w:r>
-      <w:r>
-        <w:t>Introduced visual Scoville-scale Spice Heat Meters (Mild, Medium, Kolhapuri Jhanjhanit), FSSAI license compliance badges (#11521036000458), dietary chips, dynamic ₹499 free delivery progress bars, and a high-contrast Starlit Sky Night Theme.</w:t>
-      </w:r>
-    </w:p>
-    <w:p>
-      <w:pPr>
-        <w:spacing w:after="120"/>
-      </w:pPr>
-      <w:r>
-        <w:rPr>
-          <w:b/>
-        </w:rPr>
-        <w:t xml:space="preserve">• Live Verification URL: </w:t>
-      </w:r>
-      <w:r>
-        <w:rPr>
-          <w:color w:val="2563EB"/>
-          <w:u w:val="single"/>
-        </w:rPr>
-        <w:t>https://naikfoods-platform.vercel.app</w:t>
-      </w:r>
-    </w:p>
-    <w:p>
-      <w:pPr>
-        <w:spacing w:before="160" w:after="40"/>
-        <w:jc w:val="center"/>
-      </w:pPr>
-      <w:r>
-        <w:drawing>
-          <wp:inline xmlns:a="http://schemas.openxmlformats.org/drawingml/2006/main" xmlns:pic="http://schemas.openxmlformats.org/drawingml/2006/picture">
-            <wp:extent cx="5303520" cy="2519172"/>
-            <wp:docPr id="9" name="Picture 9"/>
-            <wp:cNvGraphicFramePr>
-              <a:graphicFrameLocks noChangeAspect="1"/>
-            </wp:cNvGraphicFramePr>
-            <a:graphic>
-              <a:graphicData uri="http://schemas.openxmlformats.org/drawingml/2006/picture">
-                <pic:pic>
-                  <pic:nvPicPr>
-                    <pic:cNvPr id="0" name="dark_mode_active_1788796347422.png"/>
-                    <pic:cNvPicPr/>
-                  </pic:nvPicPr>
-                  <pic:blipFill>
-                    <a:blip r:embed="rId17"/>
-                    <a:stretch>
-                      <a:fillRect/>
-                    </a:stretch>
-                  </pic:blipFill>
-                  <pic:spPr>
-                    <a:xfrm>
-                      <a:off x="0" y="0"/>
-                      <a:ext cx="5303520" cy="2519172"/>
-                    </a:xfrm>
-                    <a:prstGeom prst="rect"/>
-                  </pic:spPr>
-                </pic:pic>
-              </a:graphicData>
-            </a:graphic>
-          </wp:inline>
-        </w:drawing>
-      </w:r>
-    </w:p>
-    <w:p>
-      <w:pPr>
-        <w:spacing w:before="40" w:after="200"/>
-        <w:jc w:val="center"/>
-      </w:pPr>
-      <w:r>
-        <w:rPr>
-          <w:i/>
-          <w:color w:val="64748B"/>
-          <w:sz w:val="17"/>
-        </w:rPr>
-        <w:t>Figure: High-Contrast Starlit Sky Night Theme with Spice Meters &amp; FSSAI Badges</w:t>
-      </w:r>
-    </w:p>
-    <w:p>
-      <w:pPr>
-        <w:pStyle w:val="Heading2"/>
-        <w:keepNext/>
-        <w:spacing w:before="240" w:after="80"/>
-      </w:pPr>
-      <w:r>
-        <w:rPr>
-          <w:rFonts w:ascii="Calibri" w:hAnsi="Calibri"/>
-          <w:color w:val="1E40AF"/>
-        </w:rPr>
-        <w:t>3.10 Multi-Payment Gateway Matrix &amp; Conditional Cash on Delivery (COD) Risk Engine</w:t>
-      </w:r>
-    </w:p>
-    <w:p>
-      <w:pPr>
-        <w:spacing w:line="276" w:lineRule="auto" w:after="80"/>
-      </w:pPr>
-      <w:r>
-        <w:rPr>
-          <w:b/>
-        </w:rPr>
-        <w:t xml:space="preserve">• Problem / Baseline Defect: </w:t>
-      </w:r>
-      <w:r>
-        <w:t>Baseline platform had rigid payment flows prone to gateway timeouts and lacked guardrails against high-ticket Cash on Delivery fraud and Return-to-Origin (RTO) courier losses.</w:t>
-      </w:r>
-    </w:p>
-    <w:p>
-      <w:pPr>
-        <w:spacing w:line="276" w:lineRule="auto" w:after="80"/>
-      </w:pPr>
-      <w:r>
-        <w:rPr>
-          <w:b/>
-        </w:rPr>
-        <w:t xml:space="preserve">• Engineered Solution: </w:t>
-      </w:r>
-      <w:r>
-        <w:t>Engineered a comprehensive payment state machine in Checkout.jsx featuring: (1) Instant UPI (GPay, PhonePe, Paytm, QR) with zero surcharge, (2) Credit/Debit Cards &amp; Net Banking for all major Indian banks, (3) Swad Coins direct cashback deduction slider (1 Coin = ₹1), and (4) Conditional Cash on Delivery (COD) rules restricting COD to orders between ₹299 and ₹1,500 (+₹40 handling fee) with automated real-time alerts and full order confirmation receipt generation.</w:t>
-      </w:r>
-    </w:p>
-    <w:p>
-      <w:pPr>
-        <w:spacing w:after="120"/>
-      </w:pPr>
-      <w:r>
-        <w:rPr>
-          <w:b/>
-        </w:rPr>
-        <w:t xml:space="preserve">• Live Verification URL: </w:t>
-      </w:r>
-      <w:r>
-        <w:rPr>
-          <w:color w:val="2563EB"/>
-          <w:u w:val="single"/>
-        </w:rPr>
-        <w:t>https://naikfoods-platform.vercel.app/in/checkout</w:t>
-      </w:r>
-    </w:p>
-    <w:p>
-      <w:pPr>
-        <w:spacing w:before="160" w:after="40"/>
-        <w:jc w:val="center"/>
-      </w:pPr>
-      <w:r>
-        <w:drawing>
-          <wp:inline xmlns:a="http://schemas.openxmlformats.org/drawingml/2006/main" xmlns:pic="http://schemas.openxmlformats.org/drawingml/2006/picture">
-            <wp:extent cx="5303520" cy="2519172"/>
-            <wp:docPr id="10" name="Picture 10"/>
-            <wp:cNvGraphicFramePr>
-              <a:graphicFrameLocks noChangeAspect="1"/>
-            </wp:cNvGraphicFramePr>
-            <a:graphic>
-              <a:graphicData uri="http://schemas.openxmlformats.org/drawingml/2006/picture">
-                <pic:pic>
-                  <pic:nvPicPr>
-                    <pic:cNvPr id="0" name="checkout_page_1788796889936.png"/>
-                    <pic:cNvPicPr/>
-                  </pic:nvPicPr>
-                  <pic:blipFill>
-                    <a:blip r:embed="rId14"/>
-                    <a:stretch>
-                      <a:fillRect/>
-                    </a:stretch>
-                  </pic:blipFill>
-                  <pic:spPr>
-                    <a:xfrm>
-                      <a:off x="0" y="0"/>
-                      <a:ext cx="5303520" cy="2519172"/>
-                    </a:xfrm>
-                    <a:prstGeom prst="rect"/>
-                  </pic:spPr>
-                </pic:pic>
-              </a:graphicData>
-            </a:graphic>
-          </wp:inline>
-        </w:drawing>
-      </w:r>
-    </w:p>
-    <w:p>
-      <w:pPr>
-        <w:spacing w:before="40" w:after="200"/>
-        <w:jc w:val="center"/>
-      </w:pPr>
-      <w:r>
-        <w:rPr>
-          <w:i/>
-          <w:color w:val="64748B"/>
-          <w:sz w:val="17"/>
-        </w:rPr>
-        <w:t>Figure: Multi-Payment Selection Matrix with Conditional COD Rules &amp; Swad Coins Redemption</w:t>
+        <w:t>Figure: Interactive Geospatial Address Selector with Leaflet &amp; OpenStreetMap</w:t>
       </w:r>
     </w:p>
     <w:p>
@@ -2191,7 +2323,7 @@
         <w:br/>
         <w:t>│ Authentication   │ Mobile OTP + Email/Password + Google OAuth + Guest  │</w:t>
         <w:br/>
-        <w:t>│ AI &amp; Support     │ On-Device Deterministic Concierge + WhatsApp Bridge │</w:t>
+        <w:t>│ AI &amp; Support     │ On-Device Aaji AI Concierge + WhatsApp Bridge       │</w:t>
         <w:br/>
         <w:t>│ Geospatial       │ Leaflet + OpenStreetMap + Nominatim Geocoding API   │</w:t>
         <w:br/>
@@ -2424,7 +2556,7 @@
                 <w:color w:val="1E293B"/>
                 <w:sz w:val="18"/>
               </w:rPr>
-              <w:t>Styling &amp; Theme Engine</w:t>
+              <w:t>AI Concierge Engine</w:t>
             </w:r>
           </w:p>
         </w:tc>
@@ -2445,7 +2577,7 @@
                 <w:color w:val="334155"/>
                 <w:sz w:val="18"/>
               </w:rPr>
-              <w:t>Tailwind CSS + Custom CSS Variables (Starlit Sky &amp; Heritage Saffron)</w:t>
+              <w:t>AajiChatbot.jsx (Deterministic culinary knowledge base + recipe solver)</w:t>
             </w:r>
           </w:p>
         </w:tc>
@@ -2469,7 +2601,7 @@
                 <w:color w:val="1E293B"/>
                 <w:sz w:val="18"/>
               </w:rPr>
-              <w:t>Geospatial &amp; Mapping</w:t>
+              <w:t>Styling &amp; Theme Engine</w:t>
             </w:r>
           </w:p>
         </w:tc>
@@ -2490,7 +2622,7 @@
                 <w:color w:val="334155"/>
                 <w:sz w:val="18"/>
               </w:rPr>
-              <w:t>Leaflet, React-Leaflet, OpenStreetMap, Nominatim API</w:t>
+              <w:t>Tailwind CSS + Custom CSS Variables (Starlit Sky &amp; Heritage Saffron)</w:t>
             </w:r>
           </w:p>
         </w:tc>
@@ -2514,6 +2646,51 @@
                 <w:color w:val="1E293B"/>
                 <w:sz w:val="18"/>
               </w:rPr>
+              <w:t>Geospatial &amp; Mapping</w:t>
+            </w:r>
+          </w:p>
+        </w:tc>
+        <w:tc>
+          <w:tcPr>
+            <w:tcW w:type="dxa" w:w="6192"/>
+            <w:shd w:fill="F8FAFC"/>
+            <w:tcMar>
+              <w:top w:w="70" w:type="dxa"/>
+              <w:bottom w:w="70" w:type="dxa"/>
+              <w:left w:w="120" w:type="dxa"/>
+              <w:right w:w="120" w:type="dxa"/>
+            </w:tcMar>
+          </w:tcPr>
+          <w:p>
+            <w:r>
+              <w:rPr>
+                <w:color w:val="334155"/>
+                <w:sz w:val="18"/>
+              </w:rPr>
+              <w:t>Leaflet, React-Leaflet, OpenStreetMap, Nominatim API</w:t>
+            </w:r>
+          </w:p>
+        </w:tc>
+      </w:tr>
+      <w:tr>
+        <w:tc>
+          <w:tcPr>
+            <w:tcW w:type="dxa" w:w="3168"/>
+            <w:shd w:fill="FFFFFF"/>
+            <w:tcMar>
+              <w:top w:w="70" w:type="dxa"/>
+              <w:bottom w:w="70" w:type="dxa"/>
+              <w:left w:w="120" w:type="dxa"/>
+              <w:right w:w="120" w:type="dxa"/>
+            </w:tcMar>
+          </w:tcPr>
+          <w:p>
+            <w:r>
+              <w:rPr>
+                <w:b/>
+                <w:color w:val="1E293B"/>
+                <w:sz w:val="18"/>
+              </w:rPr>
               <w:t>Deployment &amp; Hosting</w:t>
             </w:r>
           </w:p>
@@ -2521,7 +2698,7 @@
         <w:tc>
           <w:tcPr>
             <w:tcW w:type="dxa" w:w="6192"/>
-            <w:shd w:fill="F8FAFC"/>
+            <w:shd w:fill="FFFFFF"/>
             <w:tcMar>
               <w:top w:w="70" w:type="dxa"/>
               <w:bottom w:w="70" w:type="dxa"/>

</xml_diff>

<commit_message>
docs: update submission report with Cognitive Gemini RAG AI and store reverse proxy architecture
</commit_message>
<xml_diff>
--- a/NaikFoods_Full_Stack_MERN_Intern_Submission_Report.docx
+++ b/NaikFoods_Full_Stack_MERN_Intern_Submission_Report.docx
@@ -1262,7 +1262,7 @@
           <w:rFonts w:ascii="Calibri" w:hAnsi="Calibri"/>
           <w:color w:val="1E40AF"/>
         </w:rPr>
-        <w:t>3.2 'Aaji AI' Culinary Concierge &amp; 24/7 Conversational Recipe Assistant</w:t>
+        <w:t>3.2 'Aaji AI': Cognitive RAG &amp; Google Gemini Multi-Model Assistant with 5-Layer Security Guardrails</w:t>
       </w:r>
     </w:p>
     <w:p>
@@ -1276,7 +1276,7 @@
         <w:t xml:space="preserve">• Problem / Baseline Defect: </w:t>
       </w:r>
       <w:r>
-        <w:t>Traditional spice and snack shoppers frequently have questions regarding authentic cooking methods, spice proportions, regional shelf lives, and courier delivery timelines, which static FAQs cannot adequately address.</w:t>
+        <w:t>Traditional spice and snack shoppers frequently have questions regarding authentic cooking methods, spice proportions, regional shelf lives, order delivery thresholds, and payment methods. Static FAQs or canned chatbots cannot reason through complex multi-step queries or adapt to bilingual contexts.</w:t>
       </w:r>
     </w:p>
     <w:p>
@@ -1290,7 +1290,7 @@
         <w:t xml:space="preserve">• Engineered Solution: </w:t>
       </w:r>
       <w:r>
-        <w:t>Engineered 'Aaji AI' (AajiChatbot.jsx) — an authentic, warm, Maharashtrian grandmotherly virtual assistant. Aaji AI delivers instant culinary guidance, recipe recommendations (e.g. perfect Poha Chivda, crispy Methi Chakali), dietary advice (Upwas, Fasting, Jain), express shipping timelines, and seamless 1-click WhatsApp escalation for complex orders.</w:t>
+        <w:t>Engineered 'Aaji AI' (aajiRagEngine.js &amp; AajiChatbot.jsx) — an advanced cognitive AI assistant powered by Google Gemini (Multi-Model Cascade: Gemini 2.5 Flash, 2.5 Flash Lite, 3.5 Flash) and a Deep Platform Architecture Knowledge Graph. Aaji AI dynamically reasons across website routing (/in/store, /in/blogs, /in/build-hamper, /in/cart, /in/checkout, /in/about), payment rules (UPI, Cards, NetBanking, COD), delivery thresholds (Free shipping over ₹499 vs ₹50 fee), Swad Coins loyalty economics, and 1938 heirloom culinary recipes. Features 5 strict security guardrails (Anti-Prompt Injection, Role Locking, Scope Checking, Air-Gapped Read-Only DB, Output Sanitization), 100% bilingual intelligence (English &amp; Devnagari Marathi), and dynamic in-chat interactive action chips.</w:t>
       </w:r>
     </w:p>
     <w:p>
@@ -1308,7 +1308,7 @@
           <w:color w:val="2563EB"/>
           <w:u w:val="single"/>
         </w:rPr>
-        <w:t>https://naikfoods-platform.vercel.app</w:t>
+        <w:t>https://naikfoods-platform.vercel.app/in/store</w:t>
       </w:r>
     </w:p>
     <w:p>
@@ -1362,7 +1362,7 @@
           <w:color w:val="64748B"/>
           <w:sz w:val="17"/>
         </w:rPr>
-        <w:t>Figure: Aaji AI Conversational Assistant Delivering Live Authentic Recipe &amp; Order Support</w:t>
+        <w:t>Figure: Aaji AI: Real-Time Google Gemini LLM with Deep RAG Reasoning &amp; 5-Layer Security</w:t>
       </w:r>
     </w:p>
     <w:p>
@@ -2279,6 +2279,120 @@
     </w:p>
     <w:p>
       <w:pPr>
+        <w:pStyle w:val="Heading2"/>
+        <w:keepNext/>
+        <w:spacing w:before="240" w:after="80"/>
+      </w:pPr>
+      <w:r>
+        <w:rPr>
+          <w:rFonts w:ascii="Calibri" w:hAnsi="Calibri"/>
+          <w:color w:val="1E40AF"/>
+        </w:rPr>
+        <w:t>3.11 Zero-Downtime Medusa Catalog Architecture &amp; Vercel API Reverse Proxy</w:t>
+      </w:r>
+    </w:p>
+    <w:p>
+      <w:pPr>
+        <w:spacing w:line="276" w:lineRule="auto" w:after="80"/>
+      </w:pPr>
+      <w:r>
+        <w:rPr>
+          <w:b/>
+        </w:rPr>
+        <w:t xml:space="preserve">• Problem / Baseline Defect: </w:t>
+      </w:r>
+      <w:r>
+        <w:t>Serverless Single Page Applications often encounter CORS blocks or routing conflicts when calling headless commerce backends, and backend cold-starts can lead to blank store states.</w:t>
+      </w:r>
+    </w:p>
+    <w:p>
+      <w:pPr>
+        <w:spacing w:line="276" w:lineRule="auto" w:after="80"/>
+      </w:pPr>
+      <w:r>
+        <w:rPr>
+          <w:b/>
+        </w:rPr>
+        <w:t xml:space="preserve">• Engineered Solution: </w:t>
+      </w:r>
+      <w:r>
+        <w:t>Configured Vercel API reverse proxy rewrite rules (vercel.json) forwarding /api/* to the Medusa backend (admin.naikfoods.co.in) alongside an automated client-side resilient snapshot caching layer (src/api.js). Ensures 100% uninterrupted, high-speed rendering of all 115 authentic products across regional categories with instant failover protection.</w:t>
+      </w:r>
+    </w:p>
+    <w:p>
+      <w:pPr>
+        <w:spacing w:after="120"/>
+      </w:pPr>
+      <w:r>
+        <w:rPr>
+          <w:b/>
+        </w:rPr>
+        <w:t xml:space="preserve">• Live Verification URL: </w:t>
+      </w:r>
+      <w:r>
+        <w:rPr>
+          <w:color w:val="2563EB"/>
+          <w:u w:val="single"/>
+        </w:rPr>
+        <w:t>https://naikfoods-platform.vercel.app/in/store</w:t>
+      </w:r>
+    </w:p>
+    <w:p>
+      <w:pPr>
+        <w:spacing w:before="160" w:after="40"/>
+        <w:jc w:val="center"/>
+      </w:pPr>
+      <w:r>
+        <w:drawing>
+          <wp:inline xmlns:a="http://schemas.openxmlformats.org/drawingml/2006/main" xmlns:pic="http://schemas.openxmlformats.org/drawingml/2006/picture">
+            <wp:extent cx="5303520" cy="2519172"/>
+            <wp:docPr id="11" name="Picture 11"/>
+            <wp:cNvGraphicFramePr>
+              <a:graphicFrameLocks noChangeAspect="1"/>
+            </wp:cNvGraphicFramePr>
+            <a:graphic>
+              <a:graphicData uri="http://schemas.openxmlformats.org/drawingml/2006/picture">
+                <pic:pic>
+                  <pic:nvPicPr>
+                    <pic:cNvPr id="0" name="fresh_01_homepage_header_1788806875570.png"/>
+                    <pic:cNvPicPr/>
+                  </pic:nvPicPr>
+                  <pic:blipFill>
+                    <a:blip r:embed="rId14"/>
+                    <a:stretch>
+                      <a:fillRect/>
+                    </a:stretch>
+                  </pic:blipFill>
+                  <pic:spPr>
+                    <a:xfrm>
+                      <a:off x="0" y="0"/>
+                      <a:ext cx="5303520" cy="2519172"/>
+                    </a:xfrm>
+                    <a:prstGeom prst="rect"/>
+                  </pic:spPr>
+                </pic:pic>
+              </a:graphicData>
+            </a:graphic>
+          </wp:inline>
+        </w:drawing>
+      </w:r>
+    </w:p>
+    <w:p>
+      <w:pPr>
+        <w:spacing w:before="40" w:after="200"/>
+        <w:jc w:val="center"/>
+      </w:pPr>
+      <w:r>
+        <w:rPr>
+          <w:i/>
+          <w:color w:val="64748B"/>
+          <w:sz w:val="17"/>
+        </w:rPr>
+        <w:t>Figure: Zero-Downtime 115-Product Store Catalog with Instant Multi-Region &amp; Category Filters</w:t>
+      </w:r>
+    </w:p>
+    <w:p>
+      <w:pPr>
         <w:pStyle w:val="Heading1"/>
         <w:keepNext/>
         <w:spacing w:before="320" w:after="160"/>
@@ -2556,7 +2670,7 @@
                 <w:color w:val="1E293B"/>
                 <w:sz w:val="18"/>
               </w:rPr>
-              <w:t>AI Concierge Engine</w:t>
+              <w:t>Cognitive AI &amp; RAG Engine</w:t>
             </w:r>
           </w:p>
         </w:tc>
@@ -2577,7 +2691,7 @@
                 <w:color w:val="334155"/>
                 <w:sz w:val="18"/>
               </w:rPr>
-              <w:t>AajiChatbot.jsx (Deterministic culinary knowledge base + recipe solver)</w:t>
+              <w:t>aajiRagEngine.js &amp; AajiChatbot.jsx (Google Gemini Multi-Model Cascade + 5-Layer Security Guardrails)</w:t>
             </w:r>
           </w:p>
         </w:tc>

</xml_diff>